<commit_message>
Regenerar entregables desfasados de outputs/
demo.html y docs/index.html llevaban el payload generado el 2026-09-14:
291 con respaldo y 13 senalados, cuando outputs/sintesis-verificacion.json
dice 344 numeros, 298 con respaldo y 16 senalados. El .docx seguia
expresando los resultados como "% del recorrido" (33,8 / 62,8 / 69,5),
marco que el borrador ya habia reemplazado por la posicion en la escala
(0,3383 / 0,6283 / 0,695).

Regenerados con los scripts de la skill, nunca a mano. Comprobado antes
de commitear: la demo embebe 344/298/16 y el .md de verificacion literal,
los dos destinos HTML son identicos byte a byte y sin recursos externos,
y el .docx ya no contiene ninguna de las cadenas del marco viejo.

informe/informe-final.pdf sigue desfasado: es del 12 de agosto y no hay
en esta maquina LibreOffice ni pandoc para regenerarlo. Queda pendiente.

Co-Authored-By: Claude Opus 5 <noreply@anthropic.com>
</commit_message>
<xml_diff>
--- a/informe/informe-final.docx
+++ b/informe/informe-final.docx
@@ -3954,7 +3954,119 @@
           <w:b w:val="0"/>
           <w:i w:val="0"/>
         </w:rPr>
-        <w:t>. Un modelo con pAUC 0,10 no está "a la mitad": está al 44% del recorrido entre el azar y el clasificador perfecto. Por eso todos los resultados se expresan también como porcentaje de ese recorrido.</w:t>
+        <w:t>. Un modelo con pAUC 0,10 no está "a la mitad" de nada.</w:t>
+      </w:r>
+    </w:p>
+    <w:p>
+      <w:pPr>
+        <w:jc w:val="both"/>
+      </w:pPr>
+      <w:r>
+        <w:rPr>
+          <w:b w:val="0"/>
+          <w:i w:val="0"/>
+        </w:rPr>
+        <w:t xml:space="preserve">Para leerlos sin ese espejismo, todos los resultados se acompañan de su </w:t>
+      </w:r>
+      <w:r>
+        <w:rPr>
+          <w:b/>
+          <w:i w:val="0"/>
+        </w:rPr>
+        <w:t>posición en la escala</w:t>
+      </w:r>
+      <w:r>
+        <w:rPr>
+          <w:b w:val="0"/>
+          <w:i w:val="0"/>
+        </w:rPr>
+        <w:t xml:space="preserve">: el mismo pAUC reexpresado en una escala donde </w:t>
+      </w:r>
+      <w:r>
+        <w:rPr>
+          <w:b/>
+          <w:i w:val="0"/>
+        </w:rPr>
+        <w:t>0 es el azar y 1 el clasificador perfecto</w:t>
+      </w:r>
+      <w:r>
+        <w:rPr>
+          <w:b w:val="0"/>
+          <w:i w:val="0"/>
+        </w:rPr>
+        <w:t xml:space="preserve">, es decir </w:t>
+      </w:r>
+      <w:r>
+        <w:rPr>
+          <w:rFonts w:ascii="Menlo" w:hAnsi="Menlo"/>
+          <w:b w:val="0"/>
+          <w:i w:val="0"/>
+          <w:sz w:val="19"/>
+        </w:rPr>
+        <w:t>(pAUC − 0,02) / (0,2 − 0,02)</w:t>
+      </w:r>
+      <w:r>
+        <w:rPr>
+          <w:b w:val="0"/>
+          <w:i w:val="0"/>
+        </w:rPr>
+        <w:t xml:space="preserve">. No es un porcentaje ni una probabilidad: es dónde cae el modelo dentro del recorrido que la métrica deja disponible. Ese pAUC hipotético de 0,10 queda en la posición 0,44 de esa escala. Una posición </w:t>
+      </w:r>
+      <w:r>
+        <w:rPr>
+          <w:b/>
+          <w:i w:val="0"/>
+        </w:rPr>
+        <w:t>negativa</w:t>
+      </w:r>
+      <w:r>
+        <w:rPr>
+          <w:b w:val="0"/>
+          <w:i w:val="0"/>
+        </w:rPr>
+        <w:t xml:space="preserve"> no es un tramo hacia atrás: significa que el modelo quedó </w:t>
+      </w:r>
+      <w:r>
+        <w:rPr>
+          <w:b w:val="0"/>
+          <w:i/>
+        </w:rPr>
+        <w:t>por debajo del punto de partida</w:t>
+      </w:r>
+      <w:r>
+        <w:rPr>
+          <w:b w:val="0"/>
+          <w:i w:val="0"/>
+        </w:rPr>
+        <w:t>, fuera del recorrido, peor que no tener modelo.</w:t>
+      </w:r>
+    </w:p>
+    <w:p>
+      <w:pPr>
+        <w:jc w:val="both"/>
+      </w:pPr>
+      <w:r>
+        <w:rPr>
+          <w:b w:val="0"/>
+          <w:i w:val="0"/>
+        </w:rPr>
+        <w:t xml:space="preserve">La posición no se calcula en este informe: la emite el propio instrumento, un campo </w:t>
+      </w:r>
+      <w:r>
+        <w:rPr>
+          <w:rFonts w:ascii="Menlo" w:hAnsi="Menlo"/>
+          <w:b w:val="0"/>
+          <w:i w:val="0"/>
+          <w:sz w:val="19"/>
+        </w:rPr>
+        <w:t>posicion_en_escala</w:t>
+      </w:r>
+      <w:r>
+        <w:rPr>
+          <w:b w:val="0"/>
+          <w:i w:val="0"/>
+        </w:rPr>
+        <w:t xml:space="preserve"> por nivel, y aquí se cita tal cual.</w:t>
       </w:r>
     </w:p>
     <w:p>
@@ -4005,7 +4117,7 @@
         </w:tc>
         <w:tc>
           <w:tcPr>
-            <w:tcW w:type="dxa" w:w="2699"/>
+            <w:tcW w:type="dxa" w:w="2976"/>
           </w:tcPr>
           <w:p>
             <w:r>
@@ -4024,7 +4136,7 @@
         </w:tc>
         <w:tc>
           <w:tcPr>
-            <w:tcW w:type="dxa" w:w="1306"/>
+            <w:tcW w:type="dxa" w:w="1440"/>
           </w:tcPr>
           <w:p>
             <w:r>
@@ -4043,7 +4155,7 @@
         </w:tc>
         <w:tc>
           <w:tcPr>
-            <w:tcW w:type="dxa" w:w="1702"/>
+            <w:tcW w:type="dxa" w:w="1877"/>
           </w:tcPr>
           <w:p>
             <w:r>
@@ -4062,7 +4174,7 @@
         </w:tc>
         <w:tc>
           <w:tcPr>
-            <w:tcW w:type="dxa" w:w="2904"/>
+            <w:tcW w:type="dxa" w:w="2318"/>
           </w:tcPr>
           <w:p>
             <w:r>
@@ -4075,7 +4187,7 @@
                 <w:b/>
                 <w:i w:val="0"/>
               </w:rPr>
-              <w:t>% del recorrido azar→perfecto</w:t>
+              <w:t>Posición en la escala</w:t>
             </w:r>
           </w:p>
         </w:tc>
@@ -4098,7 +4210,7 @@
         </w:tc>
         <w:tc>
           <w:tcPr>
-            <w:tcW w:type="dxa" w:w="2699"/>
+            <w:tcW w:type="dxa" w:w="2976"/>
           </w:tcPr>
           <w:p>
             <w:r/>
@@ -4122,7 +4234,7 @@
         </w:tc>
         <w:tc>
           <w:tcPr>
-            <w:tcW w:type="dxa" w:w="1306"/>
+            <w:tcW w:type="dxa" w:w="1440"/>
           </w:tcPr>
           <w:p>
             <w:r/>
@@ -4146,7 +4258,7 @@
         </w:tc>
         <w:tc>
           <w:tcPr>
-            <w:tcW w:type="dxa" w:w="1702"/>
+            <w:tcW w:type="dxa" w:w="1877"/>
           </w:tcPr>
           <w:p>
             <w:r/>
@@ -4170,7 +4282,7 @@
         </w:tc>
         <w:tc>
           <w:tcPr>
-            <w:tcW w:type="dxa" w:w="2904"/>
+            <w:tcW w:type="dxa" w:w="2318"/>
           </w:tcPr>
           <w:p>
             <w:r/>
@@ -4179,7 +4291,7 @@
                 <w:b w:val="0"/>
                 <w:i w:val="0"/>
               </w:rPr>
-              <w:t xml:space="preserve">33,8% </w:t>
+              <w:t xml:space="preserve">0,3383 </w:t>
             </w:r>
             <w:r>
               <w:rPr>
@@ -4211,7 +4323,7 @@
         </w:tc>
         <w:tc>
           <w:tcPr>
-            <w:tcW w:type="dxa" w:w="2699"/>
+            <w:tcW w:type="dxa" w:w="2976"/>
           </w:tcPr>
           <w:p>
             <w:r/>
@@ -4226,7 +4338,7 @@
         </w:tc>
         <w:tc>
           <w:tcPr>
-            <w:tcW w:type="dxa" w:w="1306"/>
+            <w:tcW w:type="dxa" w:w="1440"/>
           </w:tcPr>
           <w:p>
             <w:r/>
@@ -4250,7 +4362,7 @@
         </w:tc>
         <w:tc>
           <w:tcPr>
-            <w:tcW w:type="dxa" w:w="1702"/>
+            <w:tcW w:type="dxa" w:w="1877"/>
           </w:tcPr>
           <w:p>
             <w:r/>
@@ -4274,7 +4386,7 @@
         </w:tc>
         <w:tc>
           <w:tcPr>
-            <w:tcW w:type="dxa" w:w="2904"/>
+            <w:tcW w:type="dxa" w:w="2318"/>
           </w:tcPr>
           <w:p>
             <w:r/>
@@ -4283,7 +4395,7 @@
                 <w:b w:val="0"/>
                 <w:i w:val="0"/>
               </w:rPr>
-              <w:t xml:space="preserve">62,8% </w:t>
+              <w:t xml:space="preserve">0,6283 </w:t>
             </w:r>
             <w:r>
               <w:rPr>
@@ -4315,7 +4427,7 @@
         </w:tc>
         <w:tc>
           <w:tcPr>
-            <w:tcW w:type="dxa" w:w="2699"/>
+            <w:tcW w:type="dxa" w:w="2976"/>
           </w:tcPr>
           <w:p>
             <w:r/>
@@ -4330,7 +4442,7 @@
         </w:tc>
         <w:tc>
           <w:tcPr>
-            <w:tcW w:type="dxa" w:w="1306"/>
+            <w:tcW w:type="dxa" w:w="1440"/>
           </w:tcPr>
           <w:p>
             <w:r/>
@@ -4354,7 +4466,7 @@
         </w:tc>
         <w:tc>
           <w:tcPr>
-            <w:tcW w:type="dxa" w:w="1702"/>
+            <w:tcW w:type="dxa" w:w="1877"/>
           </w:tcPr>
           <w:p>
             <w:r/>
@@ -4378,7 +4490,7 @@
         </w:tc>
         <w:tc>
           <w:tcPr>
-            <w:tcW w:type="dxa" w:w="2904"/>
+            <w:tcW w:type="dxa" w:w="2318"/>
           </w:tcPr>
           <w:p>
             <w:r/>
@@ -4387,7 +4499,7 @@
                 <w:b w:val="0"/>
                 <w:i w:val="0"/>
               </w:rPr>
-              <w:t xml:space="preserve">−10,4% </w:t>
+              <w:t xml:space="preserve">−0,1039 </w:t>
             </w:r>
             <w:r>
               <w:rPr>
@@ -4419,7 +4531,7 @@
         </w:tc>
         <w:tc>
           <w:tcPr>
-            <w:tcW w:type="dxa" w:w="2699"/>
+            <w:tcW w:type="dxa" w:w="2976"/>
           </w:tcPr>
           <w:p>
             <w:r/>
@@ -4434,7 +4546,7 @@
         </w:tc>
         <w:tc>
           <w:tcPr>
-            <w:tcW w:type="dxa" w:w="1306"/>
+            <w:tcW w:type="dxa" w:w="1440"/>
           </w:tcPr>
           <w:p>
             <w:r/>
@@ -4458,7 +4570,7 @@
         </w:tc>
         <w:tc>
           <w:tcPr>
-            <w:tcW w:type="dxa" w:w="1702"/>
+            <w:tcW w:type="dxa" w:w="1877"/>
           </w:tcPr>
           <w:p>
             <w:r/>
@@ -4482,7 +4594,7 @@
         </w:tc>
         <w:tc>
           <w:tcPr>
-            <w:tcW w:type="dxa" w:w="2904"/>
+            <w:tcW w:type="dxa" w:w="2318"/>
           </w:tcPr>
           <w:p>
             <w:r/>
@@ -4491,7 +4603,7 @@
                 <w:b w:val="0"/>
                 <w:i w:val="0"/>
               </w:rPr>
-              <w:t xml:space="preserve">69,5% </w:t>
+              <w:t xml:space="preserve">0,695 </w:t>
             </w:r>
             <w:r>
               <w:rPr>
@@ -4567,7 +4679,7 @@
           <w:b w:val="0"/>
           <w:i w:val="0"/>
         </w:rPr>
-        <w:t xml:space="preserve">, que suena a un predictor razonablemente fuerte. En la métrica del cliente cae al 33,8% del recorrido posible </w:t>
+        <w:t xml:space="preserve">, que suena a un predictor razonablemente fuerte. En la métrica del cliente cae a la posición 0,3383 </w:t>
       </w:r>
       <w:r>
         <w:rPr>
@@ -4609,7 +4721,39 @@
           <w:b w:val="0"/>
           <w:i w:val="0"/>
         </w:rPr>
-        <w:t xml:space="preserve"> Tanto la logística (62,8%) como el boosting balanceado (69,5%) recorren cerca del doble de distancia que la mejor columna sola. Combinar variables aporta algo real, y no era evidente de antemano.</w:t>
+        <w:t xml:space="preserve"> Tanto la logística (0,6283 </w:t>
+      </w:r>
+      <w:r>
+        <w:rPr>
+          <w:rFonts w:ascii="Menlo" w:hAnsi="Menlo"/>
+          <w:b w:val="0"/>
+          <w:i w:val="0"/>
+          <w:sz w:val="19"/>
+        </w:rPr>
+        <w:t>[T40]</w:t>
+      </w:r>
+      <w:r>
+        <w:rPr>
+          <w:b w:val="0"/>
+          <w:i w:val="0"/>
+        </w:rPr>
+        <w:t xml:space="preserve">) como el boosting balanceado (0,695 </w:t>
+      </w:r>
+      <w:r>
+        <w:rPr>
+          <w:rFonts w:ascii="Menlo" w:hAnsi="Menlo"/>
+          <w:b w:val="0"/>
+          <w:i w:val="0"/>
+          <w:sz w:val="19"/>
+        </w:rPr>
+        <w:t>[T45]</w:t>
+      </w:r>
+      <w:r>
+        <w:rPr>
+          <w:b w:val="0"/>
+          <w:i w:val="0"/>
+        </w:rPr>
+        <w:t>) llegan a cerca del doble de la posición que alcanza la mejor columna sola. Combinar variables aporta algo real, y no era evidente de antemano.</w:t>
       </w:r>
     </w:p>
     <w:p>
@@ -4658,7 +4802,21 @@
           <w:b w:val="0"/>
           <w:i w:val="0"/>
         </w:rPr>
-        <w:t xml:space="preserve"> de la métrica. Y el modo de fallo no es el de manual. Uno espera que un modelo sin ajuste de desbalance "prediga siempre negativo" y quede plano. Lo que ocurre es distinto y peor: satura en probabilidad máxima sobre un puñado de casos negativos y los coloca por encima de los positivos reales, arrasando justo la región de sensibilidad alta que la métrica evalúa. Su AUC convencional —medido como diagnóstico auxiliar, no reportado aquí porque no está en </w:t>
+        <w:t xml:space="preserve"> de la métrica. Y el modo de fallo no es el de manual. Uno espera que un modelo sin ajuste de desbalance "prediga siempre negativo" y quede plano. Lo que ocurre es distinto y peor: satura en probabilidad máxima sobre un puñado de casos negativos y los coloca por encima de los positivos reales, arrasando justo la región de sensibilidad alta que la métrica evalúa. Su AUC convencional es </w:t>
+      </w:r>
+      <w:r>
+        <w:rPr>
+          <w:b/>
+          <w:i w:val="0"/>
+        </w:rPr>
+        <w:t>0,6159</w:t>
+      </w:r>
+      <w:r>
+        <w:rPr>
+          <w:b w:val="0"/>
+          <w:i w:val="0"/>
+        </w:rPr>
+        <w:t xml:space="preserve"> </w:t>
       </w:r>
       <w:r>
         <w:rPr>
@@ -4667,14 +4825,30 @@
           <w:i w:val="0"/>
           <w:sz w:val="19"/>
         </w:rPr>
-        <w:t>outputs/</w:t>
-      </w:r>
-      <w:r>
-        <w:rPr>
-          <w:b w:val="0"/>
-          <w:i w:val="0"/>
-        </w:rPr>
-        <w:t xml:space="preserve"> y este informe no cita cifras sin respaldo— sugería un desempeño mediocre pero nada alarmante.</w:t>
+        <w:t>[T59]</w:t>
+      </w:r>
+      <w:r>
+        <w:rPr>
+          <w:b w:val="0"/>
+          <w:i w:val="0"/>
+        </w:rPr>
+        <w:t xml:space="preserve">: mediocre, pero por encima del azar de esa escala </w:t>
+      </w:r>
+      <w:r>
+        <w:rPr>
+          <w:rFonts w:ascii="Menlo" w:hAnsi="Menlo"/>
+          <w:b w:val="0"/>
+          <w:i w:val="0"/>
+          <w:sz w:val="19"/>
+        </w:rPr>
+        <w:t>[T62]</w:t>
+      </w:r>
+      <w:r>
+        <w:rPr>
+          <w:b w:val="0"/>
+          <w:i w:val="0"/>
+        </w:rPr>
+        <w:t>. Sobre exactamente las mismas predicciones, las dos métricas no discrepan en el margen sino en el veredicto —una deja al modelo por encima de su azar y la otra por debajo del suyo—, y esa discrepancia es el hallazgo, no un detalle de presentación.</w:t>
       </w:r>
     </w:p>
     <w:p>
@@ -4714,14 +4888,14 @@
           <w:b/>
           <w:i w:val="0"/>
         </w:rPr>
-        <w:t>La estabilidad discrimina más que la media.</w:t>
-      </w:r>
-      <w:r>
-        <w:rPr>
-          <w:b w:val="0"/>
-          <w:i w:val="0"/>
-        </w:rPr>
-        <w:t xml:space="preserve"> El nivel 2b no solo tiene mejor media que el nivel 1 (0,1451 frente a 0,1331) sino que es </w:t>
+        <w:t>La estabilidad parecía discriminar más que la media. No era así, y conviene ver por qué.</w:t>
+      </w:r>
+      <w:r>
+        <w:rPr>
+          <w:b w:val="0"/>
+          <w:i w:val="0"/>
+        </w:rPr>
+        <w:t xml:space="preserve"> Sobre esta partición el nivel 2b no solo tiene mejor media que el nivel 1 (0,1451 frente a 0,1331) sino que es </w:t>
       </w:r>
       <w:r>
         <w:rPr>
@@ -4767,7 +4941,7 @@
           <w:b w:val="0"/>
           <w:i w:val="0"/>
         </w:rPr>
-        <w:t>.</w:t>
+        <w:t>. Una versión anterior de esta sección convertía ese contraste en el argumento más fuerte a favor de 2b: un modelo cuyo desempeño depende menos de qué pacientes cayeron en validación es preferible ante datos nuevos, y ese argumento no descansaba en la diferencia de medias, que ya se sabía frágil.</w:t>
       </w:r>
     </w:p>
     <w:p>
@@ -4776,10 +4950,107 @@
       </w:pPr>
       <w:r>
         <w:rPr>
-          <w:b w:val="0"/>
-          <w:i w:val="0"/>
-        </w:rPr>
-        <w:t xml:space="preserve">Y aquí el consultor debe frenar en vez de rematar: </w:t>
+          <w:b/>
+          <w:i w:val="0"/>
+        </w:rPr>
+        <w:t>La validación cruzada repetida lo desmintió.</w:t>
+      </w:r>
+      <w:r>
+        <w:rPr>
+          <w:b w:val="0"/>
+          <w:i w:val="0"/>
+        </w:rPr>
+        <w:t xml:space="preserve"> Al repetir el mismo esquema con diez semillas en vez de una </w:t>
+      </w:r>
+      <w:r>
+        <w:rPr>
+          <w:rFonts w:ascii="Menlo" w:hAnsi="Menlo"/>
+          <w:b w:val="0"/>
+          <w:i w:val="0"/>
+          <w:sz w:val="19"/>
+        </w:rPr>
+        <w:t>[T50]</w:t>
+      </w:r>
+      <w:r>
+        <w:rPr>
+          <w:b w:val="0"/>
+          <w:i w:val="0"/>
+        </w:rPr>
+        <w:t xml:space="preserve">, el orden se invierte: la desviación entre folds del nivel 2b sube a ±0,0142 </w:t>
+      </w:r>
+      <w:r>
+        <w:rPr>
+          <w:rFonts w:ascii="Menlo" w:hAnsi="Menlo"/>
+          <w:b w:val="0"/>
+          <w:i w:val="0"/>
+          <w:sz w:val="19"/>
+        </w:rPr>
+        <w:t>[T52]</w:t>
+      </w:r>
+      <w:r>
+        <w:rPr>
+          <w:b w:val="0"/>
+          <w:i w:val="0"/>
+        </w:rPr>
+        <w:t xml:space="preserve"> y la del nivel 1 baja a ±0,012 </w:t>
+      </w:r>
+      <w:r>
+        <w:rPr>
+          <w:rFonts w:ascii="Menlo" w:hAnsi="Menlo"/>
+          <w:b w:val="0"/>
+          <w:i w:val="0"/>
+          <w:sz w:val="19"/>
+        </w:rPr>
+        <w:t>[T51]</w:t>
+      </w:r>
+      <w:r>
+        <w:rPr>
+          <w:b w:val="0"/>
+          <w:i w:val="0"/>
+        </w:rPr>
+        <w:t xml:space="preserve">. El menos estable de los dos pasa a ser 2b. Lo que se había leído como una propiedad del modelo era una propiedad de la semilla 42 </w:t>
+      </w:r>
+      <w:r>
+        <w:rPr>
+          <w:rFonts w:ascii="Menlo" w:hAnsi="Menlo"/>
+          <w:b w:val="0"/>
+          <w:i w:val="0"/>
+          <w:sz w:val="19"/>
+        </w:rPr>
+        <w:t>[T18b]</w:t>
+      </w:r>
+      <w:r>
+        <w:rPr>
+          <w:b w:val="0"/>
+          <w:i w:val="0"/>
+        </w:rPr>
+        <w:t xml:space="preserve">: una sola partición es una muestra de tamaño uno en el espacio de particiones, y no distingue entre las dos cosas. </w:t>
+      </w:r>
+      <w:r>
+        <w:rPr>
+          <w:b/>
+          <w:i w:val="0"/>
+        </w:rPr>
+        <w:t>El argumento de estabilidad queda retirado.</w:t>
+      </w:r>
+      <w:r>
+        <w:rPr>
+          <w:b w:val="0"/>
+          <w:i w:val="0"/>
+        </w:rPr>
+        <w:t xml:space="preserve"> No se ajusta la cifra y se sigue adelante con la misma conclusión: se retira el argumento entero, porque el defecto no estaba en el número sino en lo que se pretendía deducir de él.</w:t>
+      </w:r>
+    </w:p>
+    <w:p>
+      <w:pPr>
+        <w:jc w:val="both"/>
+      </w:pPr>
+      <w:r>
+        <w:rPr>
+          <w:b w:val="0"/>
+          <w:i w:val="0"/>
+        </w:rPr>
+        <w:t xml:space="preserve">Y el freno que sí sigue en pie: </w:t>
       </w:r>
       <w:r>
         <w:rPr>
@@ -5417,7 +5688,7 @@
           <w:b w:val="0"/>
           <w:i w:val="0"/>
         </w:rPr>
-        <w:t xml:space="preserve">Queda una asimetría real y que sí se sostiene: 2b es sensiblemente </w:t>
+        <w:t xml:space="preserve">Sobre esta partición queda una asimetría que parece real: 2b es sensiblemente </w:t>
       </w:r>
       <w:r>
         <w:rPr>
@@ -5463,7 +5734,21 @@
           <w:b w:val="0"/>
           <w:i w:val="0"/>
         </w:rPr>
-        <w:t>—, y su peor fold (0,1385) es mejor que los dos peores del nivel 1 (0,1142 y 0,1184). Un modelo cuyo desempeño depende menos de qué pacientes cayeron en validación es preferible ante datos nuevos, y ese argumento no descansa en la diferencia de medias.</w:t>
+        <w:t xml:space="preserve">—, y su peor fold (0,1385) es mejor que los dos peores del nivel 1 (0,1142 y 0,1184). </w:t>
+      </w:r>
+      <w:r>
+        <w:rPr>
+          <w:b/>
+          <w:i w:val="0"/>
+        </w:rPr>
+        <w:t>Esa asimetría no sobrevive a la repetición</w:t>
+      </w:r>
+      <w:r>
+        <w:rPr>
+          <w:b w:val="0"/>
+          <w:i w:val="0"/>
+        </w:rPr>
+        <w:t xml:space="preserve"> y no debe usarse como argumento de reserva a favor de 2b: con diez semillas el más disperso es 2b (sección 7.3).</w:t>
       </w:r>
     </w:p>
     <w:p>
@@ -5498,7 +5783,335 @@
           <w:b w:val="0"/>
           <w:i w:val="0"/>
         </w:rPr>
-        <w:t>, el diseño no tiene resolución para sostenerlo. Cuantificar la incertidumbre como es debido —remuestreo a nivel de paciente, o un número mayor de repeticiones de la validación cruzada— queda fuera del alcance de este trabajo y se declara como tal.</w:t>
+        <w:t>, el diseño no tiene resolución para sostenerlo.</w:t>
+      </w:r>
+    </w:p>
+    <w:p>
+      <w:pPr>
+        <w:pStyle w:val="Heading2"/>
+      </w:pPr>
+      <w:r>
+        <w:rPr>
+          <w:b w:val="0"/>
+          <w:i w:val="0"/>
+        </w:rPr>
+        <w:t>7.5 Validación cruzada repetida: la medición que zanja la comparación</w:t>
+      </w:r>
+    </w:p>
+    <w:p>
+      <w:pPr>
+        <w:jc w:val="both"/>
+      </w:pPr>
+      <w:r>
+        <w:rPr>
+          <w:b w:val="0"/>
+          <w:i w:val="0"/>
+        </w:rPr>
+        <w:t xml:space="preserve">Una versión anterior de la sección 7.4 cerraba declarando fuera de alcance justo lo que hacía falta —repetir la validación cruzada un número mayor de veces— y esa deuda se saldó después: el instrumento </w:t>
+      </w:r>
+      <w:r>
+        <w:rPr>
+          <w:rFonts w:ascii="Menlo" w:hAnsi="Menlo"/>
+          <w:b w:val="0"/>
+          <w:i w:val="0"/>
+          <w:sz w:val="19"/>
+        </w:rPr>
+        <w:t>modelado-baseline</w:t>
+      </w:r>
+      <w:r>
+        <w:rPr>
+          <w:b w:val="0"/>
+          <w:i w:val="0"/>
+        </w:rPr>
+        <w:t xml:space="preserve"> se extendió con un segundo script que corre el mismo esquema con </w:t>
+      </w:r>
+      <w:r>
+        <w:rPr>
+          <w:b/>
+          <w:i w:val="0"/>
+        </w:rPr>
+        <w:t>diez semillas de partición</w:t>
+      </w:r>
+      <w:r>
+        <w:rPr>
+          <w:b w:val="0"/>
+          <w:i w:val="0"/>
+        </w:rPr>
+        <w:t xml:space="preserve"> en vez de una, cinco folds cada una </w:t>
+      </w:r>
+      <w:r>
+        <w:rPr>
+          <w:rFonts w:ascii="Menlo" w:hAnsi="Menlo"/>
+          <w:b w:val="0"/>
+          <w:i w:val="0"/>
+          <w:sz w:val="19"/>
+        </w:rPr>
+        <w:t>[T50]</w:t>
+      </w:r>
+      <w:r>
+        <w:rPr>
+          <w:b w:val="0"/>
+          <w:i w:val="0"/>
+        </w:rPr>
+        <w:t>. Es la medición más fuerte que existe en este proyecto sobre la comparación entre 2b y el nivel 1, y cambia dos cosas.</w:t>
+      </w:r>
+    </w:p>
+    <w:p>
+      <w:pPr>
+        <w:jc w:val="both"/>
+      </w:pPr>
+      <w:r>
+        <w:rPr>
+          <w:b/>
+          <w:i w:val="0"/>
+        </w:rPr>
+        <w:t>Lo que cambia.</w:t>
+      </w:r>
+      <w:r>
+        <w:rPr>
+          <w:b w:val="0"/>
+          <w:i w:val="0"/>
+        </w:rPr>
+        <w:t xml:space="preserve"> El argumento de estabilidad se cae (sección 7.3). Las medias globales quedan en 0,131 para el nivel 1 y 0,1435 para 2b </w:t>
+      </w:r>
+      <w:r>
+        <w:rPr>
+          <w:rFonts w:ascii="Menlo" w:hAnsi="Menlo"/>
+          <w:b w:val="0"/>
+          <w:i w:val="0"/>
+          <w:sz w:val="19"/>
+        </w:rPr>
+        <w:t>[T53]</w:t>
+      </w:r>
+      <w:r>
+        <w:rPr>
+          <w:b w:val="0"/>
+          <w:i w:val="0"/>
+        </w:rPr>
+        <w:t xml:space="preserve">, muy cerca de lo medido sobre una sola partición, de modo que la ventaja </w:t>
+      </w:r>
+      <w:r>
+        <w:rPr>
+          <w:b w:val="0"/>
+          <w:i/>
+        </w:rPr>
+        <w:t>en dirección</w:t>
+      </w:r>
+      <w:r>
+        <w:rPr>
+          <w:b w:val="0"/>
+          <w:i w:val="0"/>
+        </w:rPr>
+        <w:t xml:space="preserve"> no era un artefacto de la semilla.</w:t>
+      </w:r>
+    </w:p>
+    <w:p>
+      <w:pPr>
+        <w:jc w:val="both"/>
+      </w:pPr>
+      <w:r>
+        <w:rPr>
+          <w:b/>
+          <w:i w:val="0"/>
+        </w:rPr>
+        <w:t>Lo que no cambia.</w:t>
+      </w:r>
+      <w:r>
+        <w:rPr>
+          <w:b w:val="0"/>
+          <w:i w:val="0"/>
+        </w:rPr>
+        <w:t xml:space="preserve"> La ventaja sigue sin poder afirmarse como magnitud. 2b gana en </w:t>
+      </w:r>
+      <w:r>
+        <w:rPr>
+          <w:b/>
+          <w:i w:val="0"/>
+        </w:rPr>
+        <w:t>40 de 50</w:t>
+      </w:r>
+      <w:r>
+        <w:rPr>
+          <w:b w:val="0"/>
+          <w:i w:val="0"/>
+        </w:rPr>
+        <w:t xml:space="preserve"> folds </w:t>
+      </w:r>
+      <w:r>
+        <w:rPr>
+          <w:rFonts w:ascii="Menlo" w:hAnsi="Menlo"/>
+          <w:b w:val="0"/>
+          <w:i w:val="0"/>
+          <w:sz w:val="19"/>
+        </w:rPr>
+        <w:t>[T54]</w:t>
+      </w:r>
+      <w:r>
+        <w:rPr>
+          <w:b w:val="0"/>
+          <w:i w:val="0"/>
+        </w:rPr>
+        <w:t xml:space="preserve"> y en </w:t>
+      </w:r>
+      <w:r>
+        <w:rPr>
+          <w:b/>
+          <w:i w:val="0"/>
+        </w:rPr>
+        <w:t>10 de 10</w:t>
+      </w:r>
+      <w:r>
+        <w:rPr>
+          <w:b w:val="0"/>
+          <w:i w:val="0"/>
+        </w:rPr>
+        <w:t xml:space="preserve"> semillas </w:t>
+      </w:r>
+      <w:r>
+        <w:rPr>
+          <w:rFonts w:ascii="Menlo" w:hAnsi="Menlo"/>
+          <w:b w:val="0"/>
+          <w:i w:val="0"/>
+          <w:sz w:val="19"/>
+        </w:rPr>
+        <w:t>[T55]</w:t>
+      </w:r>
+      <w:r>
+        <w:rPr>
+          <w:b w:val="0"/>
+          <w:i w:val="0"/>
+        </w:rPr>
+        <w:t xml:space="preserve">, con una diferencia media de 0,0125 y una desviación de 0,0136 </w:t>
+      </w:r>
+      <w:r>
+        <w:rPr>
+          <w:rFonts w:ascii="Menlo" w:hAnsi="Menlo"/>
+          <w:b w:val="0"/>
+          <w:i w:val="0"/>
+          <w:sz w:val="19"/>
+        </w:rPr>
+        <w:t>[T56]</w:t>
+      </w:r>
+      <w:r>
+        <w:rPr>
+          <w:b w:val="0"/>
+          <w:i w:val="0"/>
+        </w:rPr>
+        <w:t xml:space="preserve"> —la dispersión vuelve a exceder al efecto—. El intervalo </w:t>
+      </w:r>
+      <w:r>
+        <w:rPr>
+          <w:b w:val="0"/>
+          <w:i/>
+        </w:rPr>
+        <w:t>t</w:t>
+      </w:r>
+      <w:r>
+        <w:rPr>
+          <w:b w:val="0"/>
+          <w:i w:val="0"/>
+        </w:rPr>
+        <w:t xml:space="preserve"> ingenuo sobre esas 50 diferencias va de 0,0087 a 0,0164 </w:t>
+      </w:r>
+      <w:r>
+        <w:rPr>
+          <w:rFonts w:ascii="Menlo" w:hAnsi="Menlo"/>
+          <w:b w:val="0"/>
+          <w:i w:val="0"/>
+          <w:sz w:val="19"/>
+        </w:rPr>
+        <w:t>[T57]</w:t>
+      </w:r>
+      <w:r>
+        <w:rPr>
+          <w:b w:val="0"/>
+          <w:i w:val="0"/>
+        </w:rPr>
+        <w:t xml:space="preserve"> y </w:t>
+      </w:r>
+      <w:r>
+        <w:rPr>
+          <w:b/>
+          <w:i w:val="0"/>
+        </w:rPr>
+        <w:t>excluye</w:t>
+      </w:r>
+      <w:r>
+        <w:rPr>
+          <w:b w:val="0"/>
+          <w:i w:val="0"/>
+        </w:rPr>
+        <w:t xml:space="preserve"> el cero, pero ese intervalo no es válido aquí: supone que las 50 diferencias son independientes, y no lo son, porque los conjuntos de entrenamiento se solapan entre folds de una misma semilla. Repetir con distintas semillas elimina la dependencia de </w:t>
+      </w:r>
+      <w:r>
+        <w:rPr>
+          <w:b w:val="0"/>
+          <w:i/>
+        </w:rPr>
+        <w:t>una</w:t>
+      </w:r>
+      <w:r>
+        <w:rPr>
+          <w:b w:val="0"/>
+          <w:i w:val="0"/>
+        </w:rPr>
+        <w:t xml:space="preserve"> asignación concreta de folds, no el solape dentro de cada una.</w:t>
+      </w:r>
+    </w:p>
+    <w:p>
+      <w:pPr>
+        <w:jc w:val="both"/>
+      </w:pPr>
+      <w:r>
+        <w:rPr>
+          <w:b w:val="0"/>
+          <w:i w:val="0"/>
+        </w:rPr>
+        <w:t xml:space="preserve">Corregido ese solape con el ajuste de varianza de Nadeau y Bengio, el intervalo al 95% va de </w:t>
+      </w:r>
+      <w:r>
+        <w:rPr>
+          <w:b/>
+          <w:i w:val="0"/>
+        </w:rPr>
+        <w:t>−0,0017 a 0,0268</w:t>
+      </w:r>
+      <w:r>
+        <w:rPr>
+          <w:b w:val="0"/>
+          <w:i w:val="0"/>
+        </w:rPr>
+        <w:t xml:space="preserve"> </w:t>
+      </w:r>
+      <w:r>
+        <w:rPr>
+          <w:rFonts w:ascii="Menlo" w:hAnsi="Menlo"/>
+          <w:b w:val="0"/>
+          <w:i w:val="0"/>
+          <w:sz w:val="19"/>
+        </w:rPr>
+        <w:t>[T58]</w:t>
+      </w:r>
+      <w:r>
+        <w:rPr>
+          <w:b w:val="0"/>
+          <w:i w:val="0"/>
+        </w:rPr>
+        <w:t xml:space="preserve">: contiene el cero, por poco y por el lado esperable. La conclusión defendible es por tanto la incómoda: </w:t>
+      </w:r>
+      <w:r>
+        <w:rPr>
+          <w:b/>
+          <w:i w:val="0"/>
+        </w:rPr>
+        <w:t>la dirección del efecto es consistente hasta ser casi monótona, y su magnitud sigue sin ser distinguible de cero.</w:t>
+      </w:r>
+      <w:r>
+        <w:rPr>
+          <w:b w:val="0"/>
+          <w:i w:val="0"/>
+        </w:rPr>
+        <w:t xml:space="preserve"> Reportar el intervalo ingenuo habría convertido la misma medición en un resultado positivo; la diferencia entre uno y otro no es estadística fina, es qué se le dice al cliente.</w:t>
       </w:r>
     </w:p>
     <w:p>
@@ -5848,7 +6461,7 @@
           <w:b w:val="0"/>
           <w:i w:val="0"/>
         </w:rPr>
-        <w:t xml:space="preserve"> Los modelos combinados alcanzan entre el 62,8% </w:t>
+        <w:t xml:space="preserve"> Los modelos combinados alcanzan posiciones de entre 0,6283 </w:t>
       </w:r>
       <w:r>
         <w:rPr>
@@ -5864,7 +6477,7 @@
           <w:b w:val="0"/>
           <w:i w:val="0"/>
         </w:rPr>
-        <w:t xml:space="preserve"> y el 69,5% </w:t>
+        <w:t xml:space="preserve"> y 0,695 </w:t>
       </w:r>
       <w:r>
         <w:rPr>
@@ -5880,7 +6493,7 @@
           <w:b w:val="0"/>
           <w:i w:val="0"/>
         </w:rPr>
-        <w:t xml:space="preserve"> del recorrido entre el azar y el clasificador perfecto, frente al 33,8% </w:t>
+        <w:t xml:space="preserve"> en la escala que va de 0 en el azar a 1 en el clasificador perfecto, frente a 0,3383 </w:t>
       </w:r>
       <w:r>
         <w:rPr>
@@ -5962,7 +6575,7 @@
           <w:b w:val="0"/>
           <w:i w:val="0"/>
         </w:rPr>
-        <w:t xml:space="preserve"> La comparación pareada por fold —la forma correcta de hacerla, porque ambos se evaluaron sobre los mismos folds— lo deja claro: 2b gana en </w:t>
+        <w:t xml:space="preserve"> La comparación pareada por fold —la forma correcta de hacerla, porque ambos se evaluaron sobre los mismos folds— ya lo dejaba en duda sobre una partición: 2b gana en </w:t>
       </w:r>
       <w:r>
         <w:rPr>
@@ -6008,7 +6621,161 @@
           <w:b w:val="0"/>
           <w:i w:val="0"/>
         </w:rPr>
-        <w:t>, la desviación de las diferencias (0,0160) supera a su media (0,0120), y el intervalo contiene el cero (sección 7.4). La estabilidad sí favorece a 2b, pero eso es un argumento distinto del de superioridad en media.</w:t>
+        <w:t xml:space="preserve">, la desviación de las diferencias (0,0160) supera a su media (0,0120), y el intervalo contiene el cero (sección 7.4). La validación cruzada repetida con diez semillas </w:t>
+      </w:r>
+      <w:r>
+        <w:rPr>
+          <w:rFonts w:ascii="Menlo" w:hAnsi="Menlo"/>
+          <w:b w:val="0"/>
+          <w:i w:val="0"/>
+          <w:sz w:val="19"/>
+        </w:rPr>
+        <w:t>[T50]</w:t>
+      </w:r>
+      <w:r>
+        <w:rPr>
+          <w:b w:val="0"/>
+          <w:i w:val="0"/>
+        </w:rPr>
+        <w:t xml:space="preserve"> —la medición más fuerte que existe sobre esta comparación— lo confirma y lo precisa: 2b gana en dirección de forma casi monótona, </w:t>
+      </w:r>
+      <w:r>
+        <w:rPr>
+          <w:b/>
+          <w:i w:val="0"/>
+        </w:rPr>
+        <w:t>40 de 50</w:t>
+      </w:r>
+      <w:r>
+        <w:rPr>
+          <w:b w:val="0"/>
+          <w:i w:val="0"/>
+        </w:rPr>
+        <w:t xml:space="preserve"> folds </w:t>
+      </w:r>
+      <w:r>
+        <w:rPr>
+          <w:rFonts w:ascii="Menlo" w:hAnsi="Menlo"/>
+          <w:b w:val="0"/>
+          <w:i w:val="0"/>
+          <w:sz w:val="19"/>
+        </w:rPr>
+        <w:t>[T54]</w:t>
+      </w:r>
+      <w:r>
+        <w:rPr>
+          <w:b w:val="0"/>
+          <w:i w:val="0"/>
+        </w:rPr>
+        <w:t xml:space="preserve"> y </w:t>
+      </w:r>
+      <w:r>
+        <w:rPr>
+          <w:b/>
+          <w:i w:val="0"/>
+        </w:rPr>
+        <w:t>10 de 10</w:t>
+      </w:r>
+      <w:r>
+        <w:rPr>
+          <w:b w:val="0"/>
+          <w:i w:val="0"/>
+        </w:rPr>
+        <w:t xml:space="preserve"> semillas </w:t>
+      </w:r>
+      <w:r>
+        <w:rPr>
+          <w:rFonts w:ascii="Menlo" w:hAnsi="Menlo"/>
+          <w:b w:val="0"/>
+          <w:i w:val="0"/>
+          <w:sz w:val="19"/>
+        </w:rPr>
+        <w:t>[T55]</w:t>
+      </w:r>
+      <w:r>
+        <w:rPr>
+          <w:b w:val="0"/>
+          <w:i w:val="0"/>
+        </w:rPr>
+        <w:t xml:space="preserve">, con una diferencia media de 0,0125 </w:t>
+      </w:r>
+      <w:r>
+        <w:rPr>
+          <w:rFonts w:ascii="Menlo" w:hAnsi="Menlo"/>
+          <w:b w:val="0"/>
+          <w:i w:val="0"/>
+          <w:sz w:val="19"/>
+        </w:rPr>
+        <w:t>[T56]</w:t>
+      </w:r>
+      <w:r>
+        <w:rPr>
+          <w:b w:val="0"/>
+          <w:i w:val="0"/>
+        </w:rPr>
+        <w:t xml:space="preserve">; pero el intervalo al 95% corregido por el solape entre folds va de </w:t>
+      </w:r>
+      <w:r>
+        <w:rPr>
+          <w:b/>
+          <w:i w:val="0"/>
+        </w:rPr>
+        <w:t>−0,0017 a 0,0268</w:t>
+      </w:r>
+      <w:r>
+        <w:rPr>
+          <w:b w:val="0"/>
+          <w:i w:val="0"/>
+        </w:rPr>
+        <w:t xml:space="preserve"> </w:t>
+      </w:r>
+      <w:r>
+        <w:rPr>
+          <w:rFonts w:ascii="Menlo" w:hAnsi="Menlo"/>
+          <w:b w:val="0"/>
+          <w:i w:val="0"/>
+          <w:sz w:val="19"/>
+        </w:rPr>
+        <w:t>[T58]</w:t>
+      </w:r>
+      <w:r>
+        <w:rPr>
+          <w:b w:val="0"/>
+          <w:i w:val="0"/>
+        </w:rPr>
+        <w:t xml:space="preserve"> y sigue conteniendo el cero (sección 7.5). Dirección sí; magnitud no. Y la estabilidad ya no sirve como argumento de reserva: bajo repetición el modelo más disperso es 2b </w:t>
+      </w:r>
+      <w:r>
+        <w:rPr>
+          <w:rFonts w:ascii="Menlo" w:hAnsi="Menlo"/>
+          <w:b w:val="0"/>
+          <w:i w:val="0"/>
+          <w:sz w:val="19"/>
+        </w:rPr>
+        <w:t>[T52]</w:t>
+      </w:r>
+      <w:r>
+        <w:rPr>
+          <w:b w:val="0"/>
+          <w:i w:val="0"/>
+        </w:rPr>
+        <w:t xml:space="preserve"> </w:t>
+      </w:r>
+      <w:r>
+        <w:rPr>
+          <w:rFonts w:ascii="Menlo" w:hAnsi="Menlo"/>
+          <w:b w:val="0"/>
+          <w:i w:val="0"/>
+          <w:sz w:val="19"/>
+        </w:rPr>
+        <w:t>[T51]</w:t>
+      </w:r>
+      <w:r>
+        <w:rPr>
+          <w:b w:val="0"/>
+          <w:i w:val="0"/>
+        </w:rPr>
+        <w:t>.</w:t>
       </w:r>
     </w:p>
     <w:p>
@@ -6175,7 +6942,71 @@
           <w:b w:val="0"/>
           <w:i w:val="0"/>
         </w:rPr>
-        <w:t>, no como un hiperparámetro más. El nivel 2a demuestra que omitirlo produce un fallo silencioso bajo métricas convencionales.</w:t>
+        <w:t xml:space="preserve">, no como un hiperparámetro más. El nivel 2a demuestra que omitirlo pone a las dos métricas en desacuerdo sobre las mismas predicciones: su AUC convencional es 0,6159 </w:t>
+      </w:r>
+      <w:r>
+        <w:rPr>
+          <w:rFonts w:ascii="Menlo" w:hAnsi="Menlo"/>
+          <w:b w:val="0"/>
+          <w:i w:val="0"/>
+          <w:sz w:val="19"/>
+        </w:rPr>
+        <w:t>[T59]</w:t>
+      </w:r>
+      <w:r>
+        <w:rPr>
+          <w:b w:val="0"/>
+          <w:i w:val="0"/>
+        </w:rPr>
+        <w:t xml:space="preserve"> —mediocre, pero por encima del azar de esa escala </w:t>
+      </w:r>
+      <w:r>
+        <w:rPr>
+          <w:rFonts w:ascii="Menlo" w:hAnsi="Menlo"/>
+          <w:b w:val="0"/>
+          <w:i w:val="0"/>
+          <w:sz w:val="19"/>
+        </w:rPr>
+        <w:t>[T62]</w:t>
+      </w:r>
+      <w:r>
+        <w:rPr>
+          <w:b w:val="0"/>
+          <w:i w:val="0"/>
+        </w:rPr>
+        <w:t xml:space="preserve">— y su pAUC es 0,0013 </w:t>
+      </w:r>
+      <w:r>
+        <w:rPr>
+          <w:rFonts w:ascii="Menlo" w:hAnsi="Menlo"/>
+          <w:b w:val="0"/>
+          <w:i w:val="0"/>
+          <w:sz w:val="19"/>
+        </w:rPr>
+        <w:t>[T30b]</w:t>
+      </w:r>
+      <w:r>
+        <w:rPr>
+          <w:b w:val="0"/>
+          <w:i w:val="0"/>
+        </w:rPr>
+        <w:t xml:space="preserve">, por debajo del azar de la suya (0,02 </w:t>
+      </w:r>
+      <w:r>
+        <w:rPr>
+          <w:rFonts w:ascii="Menlo" w:hAnsi="Menlo"/>
+          <w:b w:val="0"/>
+          <w:i w:val="0"/>
+          <w:sz w:val="19"/>
+        </w:rPr>
+        <w:t>[T33]</w:t>
+      </w:r>
+      <w:r>
+        <w:rPr>
+          <w:b w:val="0"/>
+          <w:i w:val="0"/>
+        </w:rPr>
+        <w:t>). Quien reporte solo la métrica convencional verá un modelo flojo al que le falta ajuste; quien reporte la del cliente verá uno inservible. El desacuerdo entre las dos es lo que hay que llevar a la reunión, no cualquiera de ellas por separado.</w:t>
       </w:r>
     </w:p>
     <w:p>
@@ -6320,7 +7151,7 @@
         </w:tc>
         <w:tc>
           <w:tcPr>
-            <w:tcW w:type="dxa" w:w="2946"/>
+            <w:tcW w:type="dxa" w:w="3296"/>
           </w:tcPr>
           <w:p>
             <w:r>
@@ -6339,7 +7170,7 @@
         </w:tc>
         <w:tc>
           <w:tcPr>
-            <w:tcW w:type="dxa" w:w="2153"/>
+            <w:tcW w:type="dxa" w:w="2020"/>
           </w:tcPr>
           <w:p>
             <w:r>
@@ -6358,7 +7189,7 @@
         </w:tc>
         <w:tc>
           <w:tcPr>
-            <w:tcW w:type="dxa" w:w="3512"/>
+            <w:tcW w:type="dxa" w:w="3296"/>
           </w:tcPr>
           <w:p>
             <w:r>
@@ -6394,7 +7225,7 @@
         </w:tc>
         <w:tc>
           <w:tcPr>
-            <w:tcW w:type="dxa" w:w="2946"/>
+            <w:tcW w:type="dxa" w:w="3296"/>
           </w:tcPr>
           <w:p>
             <w:r/>
@@ -6409,7 +7240,7 @@
         </w:tc>
         <w:tc>
           <w:tcPr>
-            <w:tcW w:type="dxa" w:w="2153"/>
+            <w:tcW w:type="dxa" w:w="2020"/>
           </w:tcPr>
           <w:p>
             <w:r/>
@@ -6424,7 +7255,7 @@
         </w:tc>
         <w:tc>
           <w:tcPr>
-            <w:tcW w:type="dxa" w:w="3512"/>
+            <w:tcW w:type="dxa" w:w="3296"/>
           </w:tcPr>
           <w:p>
             <w:r/>
@@ -6474,7 +7305,7 @@
         </w:tc>
         <w:tc>
           <w:tcPr>
-            <w:tcW w:type="dxa" w:w="2946"/>
+            <w:tcW w:type="dxa" w:w="3296"/>
           </w:tcPr>
           <w:p>
             <w:r/>
@@ -6489,7 +7320,7 @@
         </w:tc>
         <w:tc>
           <w:tcPr>
-            <w:tcW w:type="dxa" w:w="2153"/>
+            <w:tcW w:type="dxa" w:w="2020"/>
           </w:tcPr>
           <w:p>
             <w:r/>
@@ -6504,7 +7335,7 @@
         </w:tc>
         <w:tc>
           <w:tcPr>
-            <w:tcW w:type="dxa" w:w="3512"/>
+            <w:tcW w:type="dxa" w:w="3296"/>
           </w:tcPr>
           <w:p>
             <w:r/>
@@ -6554,7 +7385,7 @@
         </w:tc>
         <w:tc>
           <w:tcPr>
-            <w:tcW w:type="dxa" w:w="2946"/>
+            <w:tcW w:type="dxa" w:w="3296"/>
           </w:tcPr>
           <w:p>
             <w:r/>
@@ -6569,7 +7400,7 @@
         </w:tc>
         <w:tc>
           <w:tcPr>
-            <w:tcW w:type="dxa" w:w="2153"/>
+            <w:tcW w:type="dxa" w:w="2020"/>
           </w:tcPr>
           <w:p>
             <w:r/>
@@ -6584,7 +7415,7 @@
         </w:tc>
         <w:tc>
           <w:tcPr>
-            <w:tcW w:type="dxa" w:w="3512"/>
+            <w:tcW w:type="dxa" w:w="3296"/>
           </w:tcPr>
           <w:p>
             <w:r/>
@@ -6634,7 +7465,7 @@
         </w:tc>
         <w:tc>
           <w:tcPr>
-            <w:tcW w:type="dxa" w:w="2946"/>
+            <w:tcW w:type="dxa" w:w="3296"/>
           </w:tcPr>
           <w:p>
             <w:r/>
@@ -6649,7 +7480,7 @@
         </w:tc>
         <w:tc>
           <w:tcPr>
-            <w:tcW w:type="dxa" w:w="2153"/>
+            <w:tcW w:type="dxa" w:w="2020"/>
           </w:tcPr>
           <w:p>
             <w:r/>
@@ -6664,7 +7495,7 @@
         </w:tc>
         <w:tc>
           <w:tcPr>
-            <w:tcW w:type="dxa" w:w="3512"/>
+            <w:tcW w:type="dxa" w:w="3296"/>
           </w:tcPr>
           <w:p>
             <w:r/>
@@ -6714,7 +7545,7 @@
         </w:tc>
         <w:tc>
           <w:tcPr>
-            <w:tcW w:type="dxa" w:w="2946"/>
+            <w:tcW w:type="dxa" w:w="3296"/>
           </w:tcPr>
           <w:p>
             <w:r/>
@@ -6729,7 +7560,7 @@
         </w:tc>
         <w:tc>
           <w:tcPr>
-            <w:tcW w:type="dxa" w:w="2153"/>
+            <w:tcW w:type="dxa" w:w="2020"/>
           </w:tcPr>
           <w:p>
             <w:r/>
@@ -6744,7 +7575,7 @@
         </w:tc>
         <w:tc>
           <w:tcPr>
-            <w:tcW w:type="dxa" w:w="3512"/>
+            <w:tcW w:type="dxa" w:w="3296"/>
           </w:tcPr>
           <w:p>
             <w:r/>
@@ -6794,7 +7625,7 @@
         </w:tc>
         <w:tc>
           <w:tcPr>
-            <w:tcW w:type="dxa" w:w="2946"/>
+            <w:tcW w:type="dxa" w:w="3296"/>
           </w:tcPr>
           <w:p>
             <w:r/>
@@ -6809,7 +7640,7 @@
         </w:tc>
         <w:tc>
           <w:tcPr>
-            <w:tcW w:type="dxa" w:w="2153"/>
+            <w:tcW w:type="dxa" w:w="2020"/>
           </w:tcPr>
           <w:p>
             <w:r/>
@@ -6824,7 +7655,7 @@
         </w:tc>
         <w:tc>
           <w:tcPr>
-            <w:tcW w:type="dxa" w:w="3512"/>
+            <w:tcW w:type="dxa" w:w="3296"/>
           </w:tcPr>
           <w:p>
             <w:r/>
@@ -6874,7 +7705,7 @@
         </w:tc>
         <w:tc>
           <w:tcPr>
-            <w:tcW w:type="dxa" w:w="2946"/>
+            <w:tcW w:type="dxa" w:w="3296"/>
           </w:tcPr>
           <w:p>
             <w:r/>
@@ -6889,7 +7720,7 @@
         </w:tc>
         <w:tc>
           <w:tcPr>
-            <w:tcW w:type="dxa" w:w="2153"/>
+            <w:tcW w:type="dxa" w:w="2020"/>
           </w:tcPr>
           <w:p>
             <w:r/>
@@ -6904,7 +7735,7 @@
         </w:tc>
         <w:tc>
           <w:tcPr>
-            <w:tcW w:type="dxa" w:w="3512"/>
+            <w:tcW w:type="dxa" w:w="3296"/>
           </w:tcPr>
           <w:p>
             <w:r/>
@@ -6954,7 +7785,7 @@
         </w:tc>
         <w:tc>
           <w:tcPr>
-            <w:tcW w:type="dxa" w:w="2946"/>
+            <w:tcW w:type="dxa" w:w="3296"/>
           </w:tcPr>
           <w:p>
             <w:r/>
@@ -6969,7 +7800,7 @@
         </w:tc>
         <w:tc>
           <w:tcPr>
-            <w:tcW w:type="dxa" w:w="2153"/>
+            <w:tcW w:type="dxa" w:w="2020"/>
           </w:tcPr>
           <w:p>
             <w:r/>
@@ -6984,7 +7815,7 @@
         </w:tc>
         <w:tc>
           <w:tcPr>
-            <w:tcW w:type="dxa" w:w="3512"/>
+            <w:tcW w:type="dxa" w:w="3296"/>
           </w:tcPr>
           <w:p>
             <w:r/>
@@ -7034,7 +7865,7 @@
         </w:tc>
         <w:tc>
           <w:tcPr>
-            <w:tcW w:type="dxa" w:w="2946"/>
+            <w:tcW w:type="dxa" w:w="3296"/>
           </w:tcPr>
           <w:p>
             <w:r/>
@@ -7049,7 +7880,7 @@
         </w:tc>
         <w:tc>
           <w:tcPr>
-            <w:tcW w:type="dxa" w:w="2153"/>
+            <w:tcW w:type="dxa" w:w="2020"/>
           </w:tcPr>
           <w:p>
             <w:r/>
@@ -7064,7 +7895,7 @@
         </w:tc>
         <w:tc>
           <w:tcPr>
-            <w:tcW w:type="dxa" w:w="3512"/>
+            <w:tcW w:type="dxa" w:w="3296"/>
           </w:tcPr>
           <w:p>
             <w:r/>
@@ -7114,7 +7945,7 @@
         </w:tc>
         <w:tc>
           <w:tcPr>
-            <w:tcW w:type="dxa" w:w="2946"/>
+            <w:tcW w:type="dxa" w:w="3296"/>
           </w:tcPr>
           <w:p>
             <w:r/>
@@ -7129,7 +7960,7 @@
         </w:tc>
         <w:tc>
           <w:tcPr>
-            <w:tcW w:type="dxa" w:w="2153"/>
+            <w:tcW w:type="dxa" w:w="2020"/>
           </w:tcPr>
           <w:p>
             <w:r/>
@@ -7144,7 +7975,7 @@
         </w:tc>
         <w:tc>
           <w:tcPr>
-            <w:tcW w:type="dxa" w:w="3512"/>
+            <w:tcW w:type="dxa" w:w="3296"/>
           </w:tcPr>
           <w:p>
             <w:r/>
@@ -7201,7 +8032,7 @@
         </w:tc>
         <w:tc>
           <w:tcPr>
-            <w:tcW w:type="dxa" w:w="2946"/>
+            <w:tcW w:type="dxa" w:w="3296"/>
           </w:tcPr>
           <w:p>
             <w:r/>
@@ -7216,7 +8047,7 @@
         </w:tc>
         <w:tc>
           <w:tcPr>
-            <w:tcW w:type="dxa" w:w="2153"/>
+            <w:tcW w:type="dxa" w:w="2020"/>
           </w:tcPr>
           <w:p>
             <w:r/>
@@ -7231,7 +8062,7 @@
         </w:tc>
         <w:tc>
           <w:tcPr>
-            <w:tcW w:type="dxa" w:w="3512"/>
+            <w:tcW w:type="dxa" w:w="3296"/>
           </w:tcPr>
           <w:p>
             <w:r/>
@@ -7281,7 +8112,7 @@
         </w:tc>
         <w:tc>
           <w:tcPr>
-            <w:tcW w:type="dxa" w:w="2946"/>
+            <w:tcW w:type="dxa" w:w="3296"/>
           </w:tcPr>
           <w:p>
             <w:r/>
@@ -7305,7 +8136,7 @@
         </w:tc>
         <w:tc>
           <w:tcPr>
-            <w:tcW w:type="dxa" w:w="2153"/>
+            <w:tcW w:type="dxa" w:w="2020"/>
           </w:tcPr>
           <w:p>
             <w:r/>
@@ -7320,7 +8151,7 @@
         </w:tc>
         <w:tc>
           <w:tcPr>
-            <w:tcW w:type="dxa" w:w="3512"/>
+            <w:tcW w:type="dxa" w:w="3296"/>
           </w:tcPr>
           <w:p>
             <w:r/>
@@ -7370,7 +8201,7 @@
         </w:tc>
         <w:tc>
           <w:tcPr>
-            <w:tcW w:type="dxa" w:w="2946"/>
+            <w:tcW w:type="dxa" w:w="3296"/>
           </w:tcPr>
           <w:p>
             <w:r/>
@@ -7394,7 +8225,7 @@
         </w:tc>
         <w:tc>
           <w:tcPr>
-            <w:tcW w:type="dxa" w:w="2153"/>
+            <w:tcW w:type="dxa" w:w="2020"/>
           </w:tcPr>
           <w:p>
             <w:r/>
@@ -7409,7 +8240,7 @@
         </w:tc>
         <w:tc>
           <w:tcPr>
-            <w:tcW w:type="dxa" w:w="3512"/>
+            <w:tcW w:type="dxa" w:w="3296"/>
           </w:tcPr>
           <w:p>
             <w:r/>
@@ -7459,7 +8290,7 @@
         </w:tc>
         <w:tc>
           <w:tcPr>
-            <w:tcW w:type="dxa" w:w="2946"/>
+            <w:tcW w:type="dxa" w:w="3296"/>
           </w:tcPr>
           <w:p>
             <w:r/>
@@ -7483,7 +8314,7 @@
         </w:tc>
         <w:tc>
           <w:tcPr>
-            <w:tcW w:type="dxa" w:w="2153"/>
+            <w:tcW w:type="dxa" w:w="2020"/>
           </w:tcPr>
           <w:p>
             <w:r/>
@@ -7498,7 +8329,7 @@
         </w:tc>
         <w:tc>
           <w:tcPr>
-            <w:tcW w:type="dxa" w:w="3512"/>
+            <w:tcW w:type="dxa" w:w="3296"/>
           </w:tcPr>
           <w:p>
             <w:r/>
@@ -7548,7 +8379,7 @@
         </w:tc>
         <w:tc>
           <w:tcPr>
-            <w:tcW w:type="dxa" w:w="2946"/>
+            <w:tcW w:type="dxa" w:w="3296"/>
           </w:tcPr>
           <w:p>
             <w:r/>
@@ -7563,7 +8394,7 @@
         </w:tc>
         <w:tc>
           <w:tcPr>
-            <w:tcW w:type="dxa" w:w="2153"/>
+            <w:tcW w:type="dxa" w:w="2020"/>
           </w:tcPr>
           <w:p>
             <w:r/>
@@ -7578,7 +8409,7 @@
         </w:tc>
         <w:tc>
           <w:tcPr>
-            <w:tcW w:type="dxa" w:w="3512"/>
+            <w:tcW w:type="dxa" w:w="3296"/>
           </w:tcPr>
           <w:p>
             <w:r/>
@@ -7628,7 +8459,7 @@
         </w:tc>
         <w:tc>
           <w:tcPr>
-            <w:tcW w:type="dxa" w:w="2946"/>
+            <w:tcW w:type="dxa" w:w="3296"/>
           </w:tcPr>
           <w:p>
             <w:r/>
@@ -7643,7 +8474,7 @@
         </w:tc>
         <w:tc>
           <w:tcPr>
-            <w:tcW w:type="dxa" w:w="2153"/>
+            <w:tcW w:type="dxa" w:w="2020"/>
           </w:tcPr>
           <w:p>
             <w:r/>
@@ -7658,7 +8489,7 @@
         </w:tc>
         <w:tc>
           <w:tcPr>
-            <w:tcW w:type="dxa" w:w="3512"/>
+            <w:tcW w:type="dxa" w:w="3296"/>
           </w:tcPr>
           <w:p>
             <w:r/>
@@ -7708,7 +8539,7 @@
         </w:tc>
         <w:tc>
           <w:tcPr>
-            <w:tcW w:type="dxa" w:w="2946"/>
+            <w:tcW w:type="dxa" w:w="3296"/>
           </w:tcPr>
           <w:p>
             <w:r/>
@@ -7723,7 +8554,7 @@
         </w:tc>
         <w:tc>
           <w:tcPr>
-            <w:tcW w:type="dxa" w:w="2153"/>
+            <w:tcW w:type="dxa" w:w="2020"/>
           </w:tcPr>
           <w:p>
             <w:r/>
@@ -7738,7 +8569,7 @@
         </w:tc>
         <w:tc>
           <w:tcPr>
-            <w:tcW w:type="dxa" w:w="3512"/>
+            <w:tcW w:type="dxa" w:w="3296"/>
           </w:tcPr>
           <w:p>
             <w:r/>
@@ -7788,7 +8619,7 @@
         </w:tc>
         <w:tc>
           <w:tcPr>
-            <w:tcW w:type="dxa" w:w="2946"/>
+            <w:tcW w:type="dxa" w:w="3296"/>
           </w:tcPr>
           <w:p>
             <w:r/>
@@ -7803,7 +8634,7 @@
         </w:tc>
         <w:tc>
           <w:tcPr>
-            <w:tcW w:type="dxa" w:w="2153"/>
+            <w:tcW w:type="dxa" w:w="2020"/>
           </w:tcPr>
           <w:p>
             <w:r/>
@@ -7818,7 +8649,7 @@
         </w:tc>
         <w:tc>
           <w:tcPr>
-            <w:tcW w:type="dxa" w:w="3512"/>
+            <w:tcW w:type="dxa" w:w="3296"/>
           </w:tcPr>
           <w:p>
             <w:r/>
@@ -7868,7 +8699,7 @@
         </w:tc>
         <w:tc>
           <w:tcPr>
-            <w:tcW w:type="dxa" w:w="2946"/>
+            <w:tcW w:type="dxa" w:w="3296"/>
           </w:tcPr>
           <w:p>
             <w:r/>
@@ -7883,7 +8714,7 @@
         </w:tc>
         <w:tc>
           <w:tcPr>
-            <w:tcW w:type="dxa" w:w="2153"/>
+            <w:tcW w:type="dxa" w:w="2020"/>
           </w:tcPr>
           <w:p>
             <w:r/>
@@ -7898,7 +8729,7 @@
         </w:tc>
         <w:tc>
           <w:tcPr>
-            <w:tcW w:type="dxa" w:w="3512"/>
+            <w:tcW w:type="dxa" w:w="3296"/>
           </w:tcPr>
           <w:p>
             <w:r/>
@@ -7948,7 +8779,7 @@
         </w:tc>
         <w:tc>
           <w:tcPr>
-            <w:tcW w:type="dxa" w:w="2946"/>
+            <w:tcW w:type="dxa" w:w="3296"/>
           </w:tcPr>
           <w:p>
             <w:r/>
@@ -7963,7 +8794,7 @@
         </w:tc>
         <w:tc>
           <w:tcPr>
-            <w:tcW w:type="dxa" w:w="2153"/>
+            <w:tcW w:type="dxa" w:w="2020"/>
           </w:tcPr>
           <w:p>
             <w:r/>
@@ -7978,7 +8809,7 @@
         </w:tc>
         <w:tc>
           <w:tcPr>
-            <w:tcW w:type="dxa" w:w="3512"/>
+            <w:tcW w:type="dxa" w:w="3296"/>
           </w:tcPr>
           <w:p>
             <w:r/>
@@ -8028,7 +8859,7 @@
         </w:tc>
         <w:tc>
           <w:tcPr>
-            <w:tcW w:type="dxa" w:w="2946"/>
+            <w:tcW w:type="dxa" w:w="3296"/>
           </w:tcPr>
           <w:p>
             <w:r/>
@@ -8043,7 +8874,7 @@
         </w:tc>
         <w:tc>
           <w:tcPr>
-            <w:tcW w:type="dxa" w:w="2153"/>
+            <w:tcW w:type="dxa" w:w="2020"/>
           </w:tcPr>
           <w:p>
             <w:r/>
@@ -8058,7 +8889,7 @@
         </w:tc>
         <w:tc>
           <w:tcPr>
-            <w:tcW w:type="dxa" w:w="3512"/>
+            <w:tcW w:type="dxa" w:w="3296"/>
           </w:tcPr>
           <w:p>
             <w:r/>
@@ -8108,7 +8939,7 @@
         </w:tc>
         <w:tc>
           <w:tcPr>
-            <w:tcW w:type="dxa" w:w="2946"/>
+            <w:tcW w:type="dxa" w:w="3296"/>
           </w:tcPr>
           <w:p>
             <w:r/>
@@ -8123,7 +8954,7 @@
         </w:tc>
         <w:tc>
           <w:tcPr>
-            <w:tcW w:type="dxa" w:w="2153"/>
+            <w:tcW w:type="dxa" w:w="2020"/>
           </w:tcPr>
           <w:p>
             <w:r/>
@@ -8138,7 +8969,7 @@
         </w:tc>
         <w:tc>
           <w:tcPr>
-            <w:tcW w:type="dxa" w:w="3512"/>
+            <w:tcW w:type="dxa" w:w="3296"/>
           </w:tcPr>
           <w:p>
             <w:r/>
@@ -8188,7 +9019,7 @@
         </w:tc>
         <w:tc>
           <w:tcPr>
-            <w:tcW w:type="dxa" w:w="2946"/>
+            <w:tcW w:type="dxa" w:w="3296"/>
           </w:tcPr>
           <w:p>
             <w:r/>
@@ -8203,7 +9034,7 @@
         </w:tc>
         <w:tc>
           <w:tcPr>
-            <w:tcW w:type="dxa" w:w="2153"/>
+            <w:tcW w:type="dxa" w:w="2020"/>
           </w:tcPr>
           <w:p>
             <w:r/>
@@ -8218,7 +9049,7 @@
         </w:tc>
         <w:tc>
           <w:tcPr>
-            <w:tcW w:type="dxa" w:w="3512"/>
+            <w:tcW w:type="dxa" w:w="3296"/>
           </w:tcPr>
           <w:p>
             <w:r/>
@@ -8268,7 +9099,7 @@
         </w:tc>
         <w:tc>
           <w:tcPr>
-            <w:tcW w:type="dxa" w:w="2946"/>
+            <w:tcW w:type="dxa" w:w="3296"/>
           </w:tcPr>
           <w:p>
             <w:r/>
@@ -8283,7 +9114,7 @@
         </w:tc>
         <w:tc>
           <w:tcPr>
-            <w:tcW w:type="dxa" w:w="2153"/>
+            <w:tcW w:type="dxa" w:w="2020"/>
           </w:tcPr>
           <w:p>
             <w:r/>
@@ -8316,7 +9147,7 @@
         </w:tc>
         <w:tc>
           <w:tcPr>
-            <w:tcW w:type="dxa" w:w="3512"/>
+            <w:tcW w:type="dxa" w:w="3296"/>
           </w:tcPr>
           <w:p>
             <w:r/>
@@ -8382,7 +9213,7 @@
         </w:tc>
         <w:tc>
           <w:tcPr>
-            <w:tcW w:type="dxa" w:w="2946"/>
+            <w:tcW w:type="dxa" w:w="3296"/>
           </w:tcPr>
           <w:p>
             <w:r/>
@@ -8397,7 +9228,7 @@
         </w:tc>
         <w:tc>
           <w:tcPr>
-            <w:tcW w:type="dxa" w:w="2153"/>
+            <w:tcW w:type="dxa" w:w="2020"/>
           </w:tcPr>
           <w:p>
             <w:r/>
@@ -8412,7 +9243,7 @@
         </w:tc>
         <w:tc>
           <w:tcPr>
-            <w:tcW w:type="dxa" w:w="3512"/>
+            <w:tcW w:type="dxa" w:w="3296"/>
           </w:tcPr>
           <w:p>
             <w:r/>
@@ -8462,7 +9293,7 @@
         </w:tc>
         <w:tc>
           <w:tcPr>
-            <w:tcW w:type="dxa" w:w="2946"/>
+            <w:tcW w:type="dxa" w:w="3296"/>
           </w:tcPr>
           <w:p>
             <w:r/>
@@ -8477,7 +9308,7 @@
         </w:tc>
         <w:tc>
           <w:tcPr>
-            <w:tcW w:type="dxa" w:w="2153"/>
+            <w:tcW w:type="dxa" w:w="2020"/>
           </w:tcPr>
           <w:p>
             <w:r/>
@@ -8492,7 +9323,7 @@
         </w:tc>
         <w:tc>
           <w:tcPr>
-            <w:tcW w:type="dxa" w:w="3512"/>
+            <w:tcW w:type="dxa" w:w="3296"/>
           </w:tcPr>
           <w:p>
             <w:r/>
@@ -8542,7 +9373,7 @@
         </w:tc>
         <w:tc>
           <w:tcPr>
-            <w:tcW w:type="dxa" w:w="2946"/>
+            <w:tcW w:type="dxa" w:w="3296"/>
           </w:tcPr>
           <w:p>
             <w:r/>
@@ -8566,7 +9397,7 @@
         </w:tc>
         <w:tc>
           <w:tcPr>
-            <w:tcW w:type="dxa" w:w="2153"/>
+            <w:tcW w:type="dxa" w:w="2020"/>
           </w:tcPr>
           <w:p>
             <w:r/>
@@ -8581,7 +9412,7 @@
         </w:tc>
         <w:tc>
           <w:tcPr>
-            <w:tcW w:type="dxa" w:w="3512"/>
+            <w:tcW w:type="dxa" w:w="3296"/>
           </w:tcPr>
           <w:p>
             <w:r/>
@@ -8631,7 +9462,7 @@
         </w:tc>
         <w:tc>
           <w:tcPr>
-            <w:tcW w:type="dxa" w:w="2946"/>
+            <w:tcW w:type="dxa" w:w="3296"/>
           </w:tcPr>
           <w:p>
             <w:r/>
@@ -8655,7 +9486,7 @@
         </w:tc>
         <w:tc>
           <w:tcPr>
-            <w:tcW w:type="dxa" w:w="2153"/>
+            <w:tcW w:type="dxa" w:w="2020"/>
           </w:tcPr>
           <w:p>
             <w:r/>
@@ -8670,7 +9501,7 @@
         </w:tc>
         <w:tc>
           <w:tcPr>
-            <w:tcW w:type="dxa" w:w="3512"/>
+            <w:tcW w:type="dxa" w:w="3296"/>
           </w:tcPr>
           <w:p>
             <w:r/>
@@ -8720,7 +9551,7 @@
         </w:tc>
         <w:tc>
           <w:tcPr>
-            <w:tcW w:type="dxa" w:w="2946"/>
+            <w:tcW w:type="dxa" w:w="3296"/>
           </w:tcPr>
           <w:p>
             <w:r/>
@@ -8744,7 +9575,7 @@
         </w:tc>
         <w:tc>
           <w:tcPr>
-            <w:tcW w:type="dxa" w:w="2153"/>
+            <w:tcW w:type="dxa" w:w="2020"/>
           </w:tcPr>
           <w:p>
             <w:r/>
@@ -8759,7 +9590,7 @@
         </w:tc>
         <w:tc>
           <w:tcPr>
-            <w:tcW w:type="dxa" w:w="3512"/>
+            <w:tcW w:type="dxa" w:w="3296"/>
           </w:tcPr>
           <w:p>
             <w:r/>
@@ -8809,7 +9640,7 @@
         </w:tc>
         <w:tc>
           <w:tcPr>
-            <w:tcW w:type="dxa" w:w="2946"/>
+            <w:tcW w:type="dxa" w:w="3296"/>
           </w:tcPr>
           <w:p>
             <w:r/>
@@ -8824,7 +9655,7 @@
         </w:tc>
         <w:tc>
           <w:tcPr>
-            <w:tcW w:type="dxa" w:w="2153"/>
+            <w:tcW w:type="dxa" w:w="2020"/>
           </w:tcPr>
           <w:p>
             <w:r/>
@@ -8839,7 +9670,7 @@
         </w:tc>
         <w:tc>
           <w:tcPr>
-            <w:tcW w:type="dxa" w:w="3512"/>
+            <w:tcW w:type="dxa" w:w="3296"/>
           </w:tcPr>
           <w:p>
             <w:r/>
@@ -8896,7 +9727,7 @@
         </w:tc>
         <w:tc>
           <w:tcPr>
-            <w:tcW w:type="dxa" w:w="2946"/>
+            <w:tcW w:type="dxa" w:w="3296"/>
           </w:tcPr>
           <w:p>
             <w:r/>
@@ -8911,7 +9742,7 @@
         </w:tc>
         <w:tc>
           <w:tcPr>
-            <w:tcW w:type="dxa" w:w="2153"/>
+            <w:tcW w:type="dxa" w:w="2020"/>
           </w:tcPr>
           <w:p>
             <w:r/>
@@ -8926,7 +9757,7 @@
         </w:tc>
         <w:tc>
           <w:tcPr>
-            <w:tcW w:type="dxa" w:w="3512"/>
+            <w:tcW w:type="dxa" w:w="3296"/>
           </w:tcPr>
           <w:p>
             <w:r/>
@@ -8976,7 +9807,7 @@
         </w:tc>
         <w:tc>
           <w:tcPr>
-            <w:tcW w:type="dxa" w:w="2946"/>
+            <w:tcW w:type="dxa" w:w="3296"/>
           </w:tcPr>
           <w:p>
             <w:r/>
@@ -9000,7 +9831,7 @@
         </w:tc>
         <w:tc>
           <w:tcPr>
-            <w:tcW w:type="dxa" w:w="2153"/>
+            <w:tcW w:type="dxa" w:w="2020"/>
           </w:tcPr>
           <w:p>
             <w:r/>
@@ -9015,7 +9846,7 @@
         </w:tc>
         <w:tc>
           <w:tcPr>
-            <w:tcW w:type="dxa" w:w="3512"/>
+            <w:tcW w:type="dxa" w:w="3296"/>
           </w:tcPr>
           <w:p>
             <w:r/>
@@ -9065,7 +9896,7 @@
         </w:tc>
         <w:tc>
           <w:tcPr>
-            <w:tcW w:type="dxa" w:w="2946"/>
+            <w:tcW w:type="dxa" w:w="3296"/>
           </w:tcPr>
           <w:p>
             <w:r/>
@@ -9080,7 +9911,7 @@
         </w:tc>
         <w:tc>
           <w:tcPr>
-            <w:tcW w:type="dxa" w:w="2153"/>
+            <w:tcW w:type="dxa" w:w="2020"/>
           </w:tcPr>
           <w:p>
             <w:r/>
@@ -9095,7 +9926,7 @@
         </w:tc>
         <w:tc>
           <w:tcPr>
-            <w:tcW w:type="dxa" w:w="3512"/>
+            <w:tcW w:type="dxa" w:w="3296"/>
           </w:tcPr>
           <w:p>
             <w:r/>
@@ -9161,7 +9992,7 @@
         </w:tc>
         <w:tc>
           <w:tcPr>
-            <w:tcW w:type="dxa" w:w="2946"/>
+            <w:tcW w:type="dxa" w:w="3296"/>
           </w:tcPr>
           <w:p>
             <w:r/>
@@ -9176,7 +10007,7 @@
         </w:tc>
         <w:tc>
           <w:tcPr>
-            <w:tcW w:type="dxa" w:w="2153"/>
+            <w:tcW w:type="dxa" w:w="2020"/>
           </w:tcPr>
           <w:p>
             <w:r/>
@@ -9191,7 +10022,7 @@
         </w:tc>
         <w:tc>
           <w:tcPr>
-            <w:tcW w:type="dxa" w:w="3512"/>
+            <w:tcW w:type="dxa" w:w="3296"/>
           </w:tcPr>
           <w:p>
             <w:r/>
@@ -9241,7 +10072,7 @@
         </w:tc>
         <w:tc>
           <w:tcPr>
-            <w:tcW w:type="dxa" w:w="2946"/>
+            <w:tcW w:type="dxa" w:w="3296"/>
           </w:tcPr>
           <w:p>
             <w:r/>
@@ -9256,7 +10087,7 @@
         </w:tc>
         <w:tc>
           <w:tcPr>
-            <w:tcW w:type="dxa" w:w="2153"/>
+            <w:tcW w:type="dxa" w:w="2020"/>
           </w:tcPr>
           <w:p>
             <w:r/>
@@ -9271,7 +10102,7 @@
         </w:tc>
         <w:tc>
           <w:tcPr>
-            <w:tcW w:type="dxa" w:w="3512"/>
+            <w:tcW w:type="dxa" w:w="3296"/>
           </w:tcPr>
           <w:p>
             <w:r/>
@@ -9321,7 +10152,7 @@
         </w:tc>
         <w:tc>
           <w:tcPr>
-            <w:tcW w:type="dxa" w:w="2946"/>
+            <w:tcW w:type="dxa" w:w="3296"/>
           </w:tcPr>
           <w:p>
             <w:r/>
@@ -9336,7 +10167,7 @@
         </w:tc>
         <w:tc>
           <w:tcPr>
-            <w:tcW w:type="dxa" w:w="2153"/>
+            <w:tcW w:type="dxa" w:w="2020"/>
           </w:tcPr>
           <w:p>
             <w:r/>
@@ -9351,7 +10182,7 @@
         </w:tc>
         <w:tc>
           <w:tcPr>
-            <w:tcW w:type="dxa" w:w="3512"/>
+            <w:tcW w:type="dxa" w:w="3296"/>
           </w:tcPr>
           <w:p>
             <w:r/>
@@ -9401,7 +10232,7 @@
         </w:tc>
         <w:tc>
           <w:tcPr>
-            <w:tcW w:type="dxa" w:w="2946"/>
+            <w:tcW w:type="dxa" w:w="3296"/>
           </w:tcPr>
           <w:p>
             <w:r/>
@@ -9416,7 +10247,7 @@
         </w:tc>
         <w:tc>
           <w:tcPr>
-            <w:tcW w:type="dxa" w:w="2153"/>
+            <w:tcW w:type="dxa" w:w="2020"/>
           </w:tcPr>
           <w:p>
             <w:r/>
@@ -9431,7 +10262,7 @@
         </w:tc>
         <w:tc>
           <w:tcPr>
-            <w:tcW w:type="dxa" w:w="3512"/>
+            <w:tcW w:type="dxa" w:w="3296"/>
           </w:tcPr>
           <w:p>
             <w:r/>
@@ -9481,7 +10312,7 @@
         </w:tc>
         <w:tc>
           <w:tcPr>
-            <w:tcW w:type="dxa" w:w="2946"/>
+            <w:tcW w:type="dxa" w:w="3296"/>
           </w:tcPr>
           <w:p>
             <w:r/>
@@ -9490,13 +10321,13 @@
                 <w:b w:val="0"/>
                 <w:i w:val="0"/>
               </w:rPr>
-              <w:t>Nivel 0 como % del recorrido</w:t>
+              <w:t>Posición en la escala del nivel 0</w:t>
             </w:r>
           </w:p>
         </w:tc>
         <w:tc>
           <w:tcPr>
-            <w:tcW w:type="dxa" w:w="2153"/>
+            <w:tcW w:type="dxa" w:w="2020"/>
           </w:tcPr>
           <w:p>
             <w:r/>
@@ -9505,13 +10336,13 @@
                 <w:b w:val="0"/>
                 <w:i w:val="0"/>
               </w:rPr>
-              <w:t>33.8</w:t>
+              <w:t>0.3383</w:t>
             </w:r>
           </w:p>
         </w:tc>
         <w:tc>
           <w:tcPr>
-            <w:tcW w:type="dxa" w:w="3512"/>
+            <w:tcW w:type="dxa" w:w="3296"/>
           </w:tcPr>
           <w:p>
             <w:r/>
@@ -9522,7 +10353,23 @@
                 <w:i w:val="0"/>
                 <w:sz w:val="17"/>
               </w:rPr>
-              <w:t>modelado-baseline.md</w:t>
+              <w:t>modelado-baseline.json</w:t>
+            </w:r>
+            <w:r>
+              <w:rPr>
+                <w:b w:val="0"/>
+                <w:i w:val="0"/>
+              </w:rPr>
+              <w:t xml:space="preserve"> → </w:t>
+            </w:r>
+            <w:r>
+              <w:rPr>
+                <w:rFonts w:ascii="Menlo" w:hAnsi="Menlo"/>
+                <w:b w:val="0"/>
+                <w:i w:val="0"/>
+                <w:sz w:val="17"/>
+              </w:rPr>
+              <w:t>nivel_0_....posicion_en_escala</w:t>
             </w:r>
           </w:p>
         </w:tc>
@@ -9545,7 +10392,7 @@
         </w:tc>
         <w:tc>
           <w:tcPr>
-            <w:tcW w:type="dxa" w:w="2946"/>
+            <w:tcW w:type="dxa" w:w="3296"/>
           </w:tcPr>
           <w:p>
             <w:r/>
@@ -9560,7 +10407,7 @@
         </w:tc>
         <w:tc>
           <w:tcPr>
-            <w:tcW w:type="dxa" w:w="2153"/>
+            <w:tcW w:type="dxa" w:w="2020"/>
           </w:tcPr>
           <w:p>
             <w:r/>
@@ -9575,7 +10422,7 @@
         </w:tc>
         <w:tc>
           <w:tcPr>
-            <w:tcW w:type="dxa" w:w="3512"/>
+            <w:tcW w:type="dxa" w:w="3296"/>
           </w:tcPr>
           <w:p>
             <w:r/>
@@ -9625,7 +10472,7 @@
         </w:tc>
         <w:tc>
           <w:tcPr>
-            <w:tcW w:type="dxa" w:w="2946"/>
+            <w:tcW w:type="dxa" w:w="3296"/>
           </w:tcPr>
           <w:p>
             <w:r/>
@@ -9640,7 +10487,7 @@
         </w:tc>
         <w:tc>
           <w:tcPr>
-            <w:tcW w:type="dxa" w:w="2153"/>
+            <w:tcW w:type="dxa" w:w="2020"/>
           </w:tcPr>
           <w:p>
             <w:r/>
@@ -9655,7 +10502,7 @@
         </w:tc>
         <w:tc>
           <w:tcPr>
-            <w:tcW w:type="dxa" w:w="3512"/>
+            <w:tcW w:type="dxa" w:w="3296"/>
           </w:tcPr>
           <w:p>
             <w:r/>
@@ -9705,7 +10552,7 @@
         </w:tc>
         <w:tc>
           <w:tcPr>
-            <w:tcW w:type="dxa" w:w="2946"/>
+            <w:tcW w:type="dxa" w:w="3296"/>
           </w:tcPr>
           <w:p>
             <w:r/>
@@ -9714,13 +10561,13 @@
                 <w:b w:val="0"/>
                 <w:i w:val="0"/>
               </w:rPr>
-              <w:t>Nivel 1 como % del recorrido</w:t>
+              <w:t>Posición en la escala del nivel 1</w:t>
             </w:r>
           </w:p>
         </w:tc>
         <w:tc>
           <w:tcPr>
-            <w:tcW w:type="dxa" w:w="2153"/>
+            <w:tcW w:type="dxa" w:w="2020"/>
           </w:tcPr>
           <w:p>
             <w:r/>
@@ -9729,13 +10576,13 @@
                 <w:b w:val="0"/>
                 <w:i w:val="0"/>
               </w:rPr>
-              <w:t>62.8</w:t>
+              <w:t>0.6283</w:t>
             </w:r>
           </w:p>
         </w:tc>
         <w:tc>
           <w:tcPr>
-            <w:tcW w:type="dxa" w:w="3512"/>
+            <w:tcW w:type="dxa" w:w="3296"/>
           </w:tcPr>
           <w:p>
             <w:r/>
@@ -9746,7 +10593,23 @@
                 <w:i w:val="0"/>
                 <w:sz w:val="17"/>
               </w:rPr>
-              <w:t>modelado-baseline.md</w:t>
+              <w:t>modelado-baseline.json</w:t>
+            </w:r>
+            <w:r>
+              <w:rPr>
+                <w:b w:val="0"/>
+                <w:i w:val="0"/>
+              </w:rPr>
+              <w:t xml:space="preserve"> → </w:t>
+            </w:r>
+            <w:r>
+              <w:rPr>
+                <w:rFonts w:ascii="Menlo" w:hAnsi="Menlo"/>
+                <w:b w:val="0"/>
+                <w:i w:val="0"/>
+                <w:sz w:val="17"/>
+              </w:rPr>
+              <w:t>nivel_1_....posicion_en_escala</w:t>
             </w:r>
           </w:p>
         </w:tc>
@@ -9769,7 +10632,7 @@
         </w:tc>
         <w:tc>
           <w:tcPr>
-            <w:tcW w:type="dxa" w:w="2946"/>
+            <w:tcW w:type="dxa" w:w="3296"/>
           </w:tcPr>
           <w:p>
             <w:r/>
@@ -9784,7 +10647,7 @@
         </w:tc>
         <w:tc>
           <w:tcPr>
-            <w:tcW w:type="dxa" w:w="2153"/>
+            <w:tcW w:type="dxa" w:w="2020"/>
           </w:tcPr>
           <w:p>
             <w:r/>
@@ -9799,7 +10662,7 @@
         </w:tc>
         <w:tc>
           <w:tcPr>
-            <w:tcW w:type="dxa" w:w="3512"/>
+            <w:tcW w:type="dxa" w:w="3296"/>
           </w:tcPr>
           <w:p>
             <w:r/>
@@ -9849,7 +10712,7 @@
         </w:tc>
         <w:tc>
           <w:tcPr>
-            <w:tcW w:type="dxa" w:w="2946"/>
+            <w:tcW w:type="dxa" w:w="3296"/>
           </w:tcPr>
           <w:p>
             <w:r/>
@@ -9858,13 +10721,13 @@
                 <w:b w:val="0"/>
                 <w:i w:val="0"/>
               </w:rPr>
-              <w:t>Nivel 2a como % del recorrido</w:t>
+              <w:t>Posición en la escala del nivel 2a</w:t>
             </w:r>
           </w:p>
         </w:tc>
         <w:tc>
           <w:tcPr>
-            <w:tcW w:type="dxa" w:w="2153"/>
+            <w:tcW w:type="dxa" w:w="2020"/>
           </w:tcPr>
           <w:p>
             <w:r/>
@@ -9873,13 +10736,13 @@
                 <w:b w:val="0"/>
                 <w:i w:val="0"/>
               </w:rPr>
-              <w:t>−10.4</w:t>
+              <w:t>−0.1039</w:t>
             </w:r>
           </w:p>
         </w:tc>
         <w:tc>
           <w:tcPr>
-            <w:tcW w:type="dxa" w:w="3512"/>
+            <w:tcW w:type="dxa" w:w="3296"/>
           </w:tcPr>
           <w:p>
             <w:r/>
@@ -9890,7 +10753,23 @@
                 <w:i w:val="0"/>
                 <w:sz w:val="17"/>
               </w:rPr>
-              <w:t>modelado-baseline.md</w:t>
+              <w:t>modelado-baseline.json</w:t>
+            </w:r>
+            <w:r>
+              <w:rPr>
+                <w:b w:val="0"/>
+                <w:i w:val="0"/>
+              </w:rPr>
+              <w:t xml:space="preserve"> → </w:t>
+            </w:r>
+            <w:r>
+              <w:rPr>
+                <w:rFonts w:ascii="Menlo" w:hAnsi="Menlo"/>
+                <w:b w:val="0"/>
+                <w:i w:val="0"/>
+                <w:sz w:val="17"/>
+              </w:rPr>
+              <w:t>nivel_2a_....posicion_en_escala</w:t>
             </w:r>
           </w:p>
         </w:tc>
@@ -9913,7 +10792,7 @@
         </w:tc>
         <w:tc>
           <w:tcPr>
-            <w:tcW w:type="dxa" w:w="2946"/>
+            <w:tcW w:type="dxa" w:w="3296"/>
           </w:tcPr>
           <w:p>
             <w:r/>
@@ -9928,7 +10807,7 @@
         </w:tc>
         <w:tc>
           <w:tcPr>
-            <w:tcW w:type="dxa" w:w="2153"/>
+            <w:tcW w:type="dxa" w:w="2020"/>
           </w:tcPr>
           <w:p>
             <w:r/>
@@ -9943,7 +10822,7 @@
         </w:tc>
         <w:tc>
           <w:tcPr>
-            <w:tcW w:type="dxa" w:w="3512"/>
+            <w:tcW w:type="dxa" w:w="3296"/>
           </w:tcPr>
           <w:p>
             <w:r/>
@@ -9993,7 +10872,7 @@
         </w:tc>
         <w:tc>
           <w:tcPr>
-            <w:tcW w:type="dxa" w:w="2946"/>
+            <w:tcW w:type="dxa" w:w="3296"/>
           </w:tcPr>
           <w:p>
             <w:r/>
@@ -10008,7 +10887,7 @@
         </w:tc>
         <w:tc>
           <w:tcPr>
-            <w:tcW w:type="dxa" w:w="2153"/>
+            <w:tcW w:type="dxa" w:w="2020"/>
           </w:tcPr>
           <w:p>
             <w:r/>
@@ -10023,7 +10902,7 @@
         </w:tc>
         <w:tc>
           <w:tcPr>
-            <w:tcW w:type="dxa" w:w="3512"/>
+            <w:tcW w:type="dxa" w:w="3296"/>
           </w:tcPr>
           <w:p>
             <w:r/>
@@ -10073,7 +10952,7 @@
         </w:tc>
         <w:tc>
           <w:tcPr>
-            <w:tcW w:type="dxa" w:w="2946"/>
+            <w:tcW w:type="dxa" w:w="3296"/>
           </w:tcPr>
           <w:p>
             <w:r/>
@@ -10082,13 +10961,13 @@
                 <w:b w:val="0"/>
                 <w:i w:val="0"/>
               </w:rPr>
-              <w:t>Nivel 2b como % del recorrido</w:t>
+              <w:t>Posición en la escala del nivel 2b</w:t>
             </w:r>
           </w:p>
         </w:tc>
         <w:tc>
           <w:tcPr>
-            <w:tcW w:type="dxa" w:w="2153"/>
+            <w:tcW w:type="dxa" w:w="2020"/>
           </w:tcPr>
           <w:p>
             <w:r/>
@@ -10097,13 +10976,13 @@
                 <w:b w:val="0"/>
                 <w:i w:val="0"/>
               </w:rPr>
-              <w:t>69.5</w:t>
+              <w:t>0.695</w:t>
             </w:r>
           </w:p>
         </w:tc>
         <w:tc>
           <w:tcPr>
-            <w:tcW w:type="dxa" w:w="3512"/>
+            <w:tcW w:type="dxa" w:w="3296"/>
           </w:tcPr>
           <w:p>
             <w:r/>
@@ -10114,7 +10993,23 @@
                 <w:i w:val="0"/>
                 <w:sz w:val="17"/>
               </w:rPr>
-              <w:t>modelado-baseline.md</w:t>
+              <w:t>modelado-baseline.json</w:t>
+            </w:r>
+            <w:r>
+              <w:rPr>
+                <w:b w:val="0"/>
+                <w:i w:val="0"/>
+              </w:rPr>
+              <w:t xml:space="preserve"> → </w:t>
+            </w:r>
+            <w:r>
+              <w:rPr>
+                <w:rFonts w:ascii="Menlo" w:hAnsi="Menlo"/>
+                <w:b w:val="0"/>
+                <w:i w:val="0"/>
+                <w:sz w:val="17"/>
+              </w:rPr>
+              <w:t>nivel_2b_....posicion_en_escala</w:t>
             </w:r>
           </w:p>
         </w:tc>
@@ -10137,7 +11032,7 @@
         </w:tc>
         <w:tc>
           <w:tcPr>
-            <w:tcW w:type="dxa" w:w="2946"/>
+            <w:tcW w:type="dxa" w:w="3296"/>
           </w:tcPr>
           <w:p>
             <w:r/>
@@ -10152,7 +11047,7 @@
         </w:tc>
         <w:tc>
           <w:tcPr>
-            <w:tcW w:type="dxa" w:w="2153"/>
+            <w:tcW w:type="dxa" w:w="2020"/>
           </w:tcPr>
           <w:p>
             <w:r/>
@@ -10169,7 +11064,7 @@
         </w:tc>
         <w:tc>
           <w:tcPr>
-            <w:tcW w:type="dxa" w:w="3512"/>
+            <w:tcW w:type="dxa" w:w="3296"/>
           </w:tcPr>
           <w:p>
             <w:r/>
@@ -10235,7 +11130,7 @@
         </w:tc>
         <w:tc>
           <w:tcPr>
-            <w:tcW w:type="dxa" w:w="2946"/>
+            <w:tcW w:type="dxa" w:w="3296"/>
           </w:tcPr>
           <w:p>
             <w:r/>
@@ -10250,7 +11145,7 @@
         </w:tc>
         <w:tc>
           <w:tcPr>
-            <w:tcW w:type="dxa" w:w="2153"/>
+            <w:tcW w:type="dxa" w:w="2020"/>
           </w:tcPr>
           <w:p>
             <w:r/>
@@ -10265,7 +11160,7 @@
         </w:tc>
         <w:tc>
           <w:tcPr>
-            <w:tcW w:type="dxa" w:w="3512"/>
+            <w:tcW w:type="dxa" w:w="3296"/>
           </w:tcPr>
           <w:p>
             <w:r/>
@@ -10315,7 +11210,7 @@
         </w:tc>
         <w:tc>
           <w:tcPr>
-            <w:tcW w:type="dxa" w:w="2946"/>
+            <w:tcW w:type="dxa" w:w="3296"/>
           </w:tcPr>
           <w:p>
             <w:r/>
@@ -10330,7 +11225,7 @@
         </w:tc>
         <w:tc>
           <w:tcPr>
-            <w:tcW w:type="dxa" w:w="2153"/>
+            <w:tcW w:type="dxa" w:w="2020"/>
           </w:tcPr>
           <w:p>
             <w:r/>
@@ -10345,7 +11240,7 @@
         </w:tc>
         <w:tc>
           <w:tcPr>
-            <w:tcW w:type="dxa" w:w="3512"/>
+            <w:tcW w:type="dxa" w:w="3296"/>
           </w:tcPr>
           <w:p>
             <w:r/>
@@ -10395,7 +11290,7 @@
         </w:tc>
         <w:tc>
           <w:tcPr>
-            <w:tcW w:type="dxa" w:w="2946"/>
+            <w:tcW w:type="dxa" w:w="3296"/>
           </w:tcPr>
           <w:p>
             <w:r/>
@@ -10410,7 +11305,7 @@
         </w:tc>
         <w:tc>
           <w:tcPr>
-            <w:tcW w:type="dxa" w:w="2153"/>
+            <w:tcW w:type="dxa" w:w="2020"/>
           </w:tcPr>
           <w:p>
             <w:r/>
@@ -10425,7 +11320,7 @@
         </w:tc>
         <w:tc>
           <w:tcPr>
-            <w:tcW w:type="dxa" w:w="3512"/>
+            <w:tcW w:type="dxa" w:w="3296"/>
           </w:tcPr>
           <w:p>
             <w:r/>
@@ -10453,6 +11348,1154 @@
                 <w:sz w:val="17"/>
               </w:rPr>
               <w:t>nivel_2b_....pauc_por_fold</w:t>
+            </w:r>
+          </w:p>
+        </w:tc>
+      </w:tr>
+      <w:tr>
+        <w:tc>
+          <w:tcPr>
+            <w:tcW w:type="dxa" w:w="1037"/>
+          </w:tcPr>
+          <w:p>
+            <w:r/>
+            <w:r>
+              <w:rPr>
+                <w:b w:val="0"/>
+                <w:i w:val="0"/>
+              </w:rPr>
+              <w:t>T50</w:t>
+            </w:r>
+          </w:p>
+        </w:tc>
+        <w:tc>
+          <w:tcPr>
+            <w:tcW w:type="dxa" w:w="3296"/>
+          </w:tcPr>
+          <w:p>
+            <w:r/>
+            <w:r>
+              <w:rPr>
+                <w:b w:val="0"/>
+                <w:i w:val="0"/>
+              </w:rPr>
+              <w:t>Diseño de la validación repetida</w:t>
+            </w:r>
+          </w:p>
+        </w:tc>
+        <w:tc>
+          <w:tcPr>
+            <w:tcW w:type="dxa" w:w="2020"/>
+          </w:tcPr>
+          <w:p>
+            <w:r/>
+            <w:r>
+              <w:rPr>
+                <w:b w:val="0"/>
+                <w:i w:val="0"/>
+              </w:rPr>
+              <w:t>10 semillas × 5 folds</w:t>
+            </w:r>
+          </w:p>
+        </w:tc>
+        <w:tc>
+          <w:tcPr>
+            <w:tcW w:type="dxa" w:w="3296"/>
+          </w:tcPr>
+          <w:p>
+            <w:r/>
+            <w:r>
+              <w:rPr>
+                <w:rFonts w:ascii="Menlo" w:hAnsi="Menlo"/>
+                <w:b w:val="0"/>
+                <w:i w:val="0"/>
+                <w:sz w:val="17"/>
+              </w:rPr>
+              <w:t>validacion-repetida.json</w:t>
+            </w:r>
+            <w:r>
+              <w:rPr>
+                <w:b w:val="0"/>
+                <w:i w:val="0"/>
+              </w:rPr>
+              <w:t xml:space="preserve"> → </w:t>
+            </w:r>
+            <w:r>
+              <w:rPr>
+                <w:rFonts w:ascii="Menlo" w:hAnsi="Menlo"/>
+                <w:b w:val="0"/>
+                <w:i w:val="0"/>
+                <w:sz w:val="17"/>
+              </w:rPr>
+              <w:t>semillas_corridas</w:t>
+            </w:r>
+            <w:r>
+              <w:rPr>
+                <w:b w:val="0"/>
+                <w:i w:val="0"/>
+              </w:rPr>
+              <w:t xml:space="preserve">, </w:t>
+            </w:r>
+            <w:r>
+              <w:rPr>
+                <w:rFonts w:ascii="Menlo" w:hAnsi="Menlo"/>
+                <w:b w:val="0"/>
+                <w:i w:val="0"/>
+                <w:sz w:val="17"/>
+              </w:rPr>
+              <w:t>n_splits</w:t>
+            </w:r>
+          </w:p>
+        </w:tc>
+      </w:tr>
+      <w:tr>
+        <w:tc>
+          <w:tcPr>
+            <w:tcW w:type="dxa" w:w="1037"/>
+          </w:tcPr>
+          <w:p>
+            <w:r/>
+            <w:r>
+              <w:rPr>
+                <w:b w:val="0"/>
+                <w:i w:val="0"/>
+              </w:rPr>
+              <w:t>T51</w:t>
+            </w:r>
+          </w:p>
+        </w:tc>
+        <w:tc>
+          <w:tcPr>
+            <w:tcW w:type="dxa" w:w="3296"/>
+          </w:tcPr>
+          <w:p>
+            <w:r/>
+            <w:r>
+              <w:rPr>
+                <w:b w:val="0"/>
+                <w:i w:val="0"/>
+              </w:rPr>
+              <w:t>Desviación entre folds del nivel 1, diez semillas</w:t>
+            </w:r>
+          </w:p>
+        </w:tc>
+        <w:tc>
+          <w:tcPr>
+            <w:tcW w:type="dxa" w:w="2020"/>
+          </w:tcPr>
+          <w:p>
+            <w:r/>
+            <w:r>
+              <w:rPr>
+                <w:b w:val="0"/>
+                <w:i w:val="0"/>
+              </w:rPr>
+              <w:t>0.012</w:t>
+            </w:r>
+          </w:p>
+        </w:tc>
+        <w:tc>
+          <w:tcPr>
+            <w:tcW w:type="dxa" w:w="3296"/>
+          </w:tcPr>
+          <w:p>
+            <w:r/>
+            <w:r>
+              <w:rPr>
+                <w:rFonts w:ascii="Menlo" w:hAnsi="Menlo"/>
+                <w:b w:val="0"/>
+                <w:i w:val="0"/>
+                <w:sz w:val="17"/>
+              </w:rPr>
+              <w:t>validacion-repetida.json</w:t>
+            </w:r>
+            <w:r>
+              <w:rPr>
+                <w:b w:val="0"/>
+                <w:i w:val="0"/>
+              </w:rPr>
+              <w:t xml:space="preserve"> → </w:t>
+            </w:r>
+            <w:r>
+              <w:rPr>
+                <w:rFonts w:ascii="Menlo" w:hAnsi="Menlo"/>
+                <w:b w:val="0"/>
+                <w:i w:val="0"/>
+                <w:sz w:val="17"/>
+              </w:rPr>
+              <w:t>nivel_1_....pauc_std_entre_folds</w:t>
+            </w:r>
+          </w:p>
+        </w:tc>
+      </w:tr>
+      <w:tr>
+        <w:tc>
+          <w:tcPr>
+            <w:tcW w:type="dxa" w:w="1037"/>
+          </w:tcPr>
+          <w:p>
+            <w:r/>
+            <w:r>
+              <w:rPr>
+                <w:b w:val="0"/>
+                <w:i w:val="0"/>
+              </w:rPr>
+              <w:t>T52</w:t>
+            </w:r>
+          </w:p>
+        </w:tc>
+        <w:tc>
+          <w:tcPr>
+            <w:tcW w:type="dxa" w:w="3296"/>
+          </w:tcPr>
+          <w:p>
+            <w:r/>
+            <w:r>
+              <w:rPr>
+                <w:b w:val="0"/>
+                <w:i w:val="0"/>
+              </w:rPr>
+              <w:t>Desviación entre folds del nivel 2b, diez semillas</w:t>
+            </w:r>
+          </w:p>
+        </w:tc>
+        <w:tc>
+          <w:tcPr>
+            <w:tcW w:type="dxa" w:w="2020"/>
+          </w:tcPr>
+          <w:p>
+            <w:r/>
+            <w:r>
+              <w:rPr>
+                <w:b w:val="0"/>
+                <w:i w:val="0"/>
+              </w:rPr>
+              <w:t>0.0142</w:t>
+            </w:r>
+          </w:p>
+        </w:tc>
+        <w:tc>
+          <w:tcPr>
+            <w:tcW w:type="dxa" w:w="3296"/>
+          </w:tcPr>
+          <w:p>
+            <w:r/>
+            <w:r>
+              <w:rPr>
+                <w:rFonts w:ascii="Menlo" w:hAnsi="Menlo"/>
+                <w:b w:val="0"/>
+                <w:i w:val="0"/>
+                <w:sz w:val="17"/>
+              </w:rPr>
+              <w:t>validacion-repetida.json</w:t>
+            </w:r>
+            <w:r>
+              <w:rPr>
+                <w:b w:val="0"/>
+                <w:i w:val="0"/>
+              </w:rPr>
+              <w:t xml:space="preserve"> → </w:t>
+            </w:r>
+            <w:r>
+              <w:rPr>
+                <w:rFonts w:ascii="Menlo" w:hAnsi="Menlo"/>
+                <w:b w:val="0"/>
+                <w:i w:val="0"/>
+                <w:sz w:val="17"/>
+              </w:rPr>
+              <w:t>nivel_2b_....pauc_std_entre_folds</w:t>
+            </w:r>
+          </w:p>
+        </w:tc>
+      </w:tr>
+      <w:tr>
+        <w:tc>
+          <w:tcPr>
+            <w:tcW w:type="dxa" w:w="1037"/>
+          </w:tcPr>
+          <w:p>
+            <w:r/>
+            <w:r>
+              <w:rPr>
+                <w:b w:val="0"/>
+                <w:i w:val="0"/>
+              </w:rPr>
+              <w:t>T53</w:t>
+            </w:r>
+          </w:p>
+        </w:tc>
+        <w:tc>
+          <w:tcPr>
+            <w:tcW w:type="dxa" w:w="3296"/>
+          </w:tcPr>
+          <w:p>
+            <w:r/>
+            <w:r>
+              <w:rPr>
+                <w:b w:val="0"/>
+                <w:i w:val="0"/>
+              </w:rPr>
+              <w:t>pAUC medio global, diez semillas</w:t>
+            </w:r>
+          </w:p>
+        </w:tc>
+        <w:tc>
+          <w:tcPr>
+            <w:tcW w:type="dxa" w:w="2020"/>
+          </w:tcPr>
+          <w:p>
+            <w:r/>
+            <w:r>
+              <w:rPr>
+                <w:b w:val="0"/>
+                <w:i w:val="0"/>
+              </w:rPr>
+              <w:t>0.131 (nivel 1), 0.1435 (nivel 2b)</w:t>
+            </w:r>
+          </w:p>
+        </w:tc>
+        <w:tc>
+          <w:tcPr>
+            <w:tcW w:type="dxa" w:w="3296"/>
+          </w:tcPr>
+          <w:p>
+            <w:r/>
+            <w:r>
+              <w:rPr>
+                <w:rFonts w:ascii="Menlo" w:hAnsi="Menlo"/>
+                <w:b w:val="0"/>
+                <w:i w:val="0"/>
+                <w:sz w:val="17"/>
+              </w:rPr>
+              <w:t>validacion-repetida.json</w:t>
+            </w:r>
+            <w:r>
+              <w:rPr>
+                <w:b w:val="0"/>
+                <w:i w:val="0"/>
+              </w:rPr>
+              <w:t xml:space="preserve"> → </w:t>
+            </w:r>
+            <w:r>
+              <w:rPr>
+                <w:rFonts w:ascii="Menlo" w:hAnsi="Menlo"/>
+                <w:b w:val="0"/>
+                <w:i w:val="0"/>
+                <w:sz w:val="17"/>
+              </w:rPr>
+              <w:t>nivel_1_....pauc_media_global</w:t>
+            </w:r>
+            <w:r>
+              <w:rPr>
+                <w:b w:val="0"/>
+                <w:i w:val="0"/>
+              </w:rPr>
+              <w:t xml:space="preserve">, </w:t>
+            </w:r>
+            <w:r>
+              <w:rPr>
+                <w:rFonts w:ascii="Menlo" w:hAnsi="Menlo"/>
+                <w:b w:val="0"/>
+                <w:i w:val="0"/>
+                <w:sz w:val="17"/>
+              </w:rPr>
+              <w:t>nivel_2b_....pauc_media_global</w:t>
+            </w:r>
+          </w:p>
+        </w:tc>
+      </w:tr>
+      <w:tr>
+        <w:tc>
+          <w:tcPr>
+            <w:tcW w:type="dxa" w:w="1037"/>
+          </w:tcPr>
+          <w:p>
+            <w:r/>
+            <w:r>
+              <w:rPr>
+                <w:b w:val="0"/>
+                <w:i w:val="0"/>
+              </w:rPr>
+              <w:t>T54</w:t>
+            </w:r>
+          </w:p>
+        </w:tc>
+        <w:tc>
+          <w:tcPr>
+            <w:tcW w:type="dxa" w:w="3296"/>
+          </w:tcPr>
+          <w:p>
+            <w:r/>
+            <w:r>
+              <w:rPr>
+                <w:b w:val="0"/>
+                <w:i w:val="0"/>
+              </w:rPr>
+              <w:t>Folds en que 2b supera al nivel 1</w:t>
+            </w:r>
+          </w:p>
+        </w:tc>
+        <w:tc>
+          <w:tcPr>
+            <w:tcW w:type="dxa" w:w="2020"/>
+          </w:tcPr>
+          <w:p>
+            <w:r/>
+            <w:r>
+              <w:rPr>
+                <w:b w:val="0"/>
+                <w:i w:val="0"/>
+              </w:rPr>
+              <w:t>40 de 50</w:t>
+            </w:r>
+          </w:p>
+        </w:tc>
+        <w:tc>
+          <w:tcPr>
+            <w:tcW w:type="dxa" w:w="3296"/>
+          </w:tcPr>
+          <w:p>
+            <w:r/>
+            <w:r>
+              <w:rPr>
+                <w:rFonts w:ascii="Menlo" w:hAnsi="Menlo"/>
+                <w:b w:val="0"/>
+                <w:i w:val="0"/>
+                <w:sz w:val="17"/>
+              </w:rPr>
+              <w:t>validacion-repetida.json</w:t>
+            </w:r>
+            <w:r>
+              <w:rPr>
+                <w:b w:val="0"/>
+                <w:i w:val="0"/>
+              </w:rPr>
+              <w:t xml:space="preserve"> → </w:t>
+            </w:r>
+            <w:r>
+              <w:rPr>
+                <w:rFonts w:ascii="Menlo" w:hAnsi="Menlo"/>
+                <w:b w:val="0"/>
+                <w:i w:val="0"/>
+                <w:sz w:val="17"/>
+              </w:rPr>
+              <w:t>comparacion_pareada_2b_menos_1.gana_2b_en</w:t>
+            </w:r>
+            <w:r>
+              <w:rPr>
+                <w:b w:val="0"/>
+                <w:i w:val="0"/>
+              </w:rPr>
+              <w:t xml:space="preserve">, </w:t>
+            </w:r>
+            <w:r>
+              <w:rPr>
+                <w:rFonts w:ascii="Menlo" w:hAnsi="Menlo"/>
+                <w:b w:val="0"/>
+                <w:i w:val="0"/>
+                <w:sz w:val="17"/>
+              </w:rPr>
+              <w:t>.de</w:t>
+            </w:r>
+          </w:p>
+        </w:tc>
+      </w:tr>
+      <w:tr>
+        <w:tc>
+          <w:tcPr>
+            <w:tcW w:type="dxa" w:w="1037"/>
+          </w:tcPr>
+          <w:p>
+            <w:r/>
+            <w:r>
+              <w:rPr>
+                <w:b w:val="0"/>
+                <w:i w:val="0"/>
+              </w:rPr>
+              <w:t>T55</w:t>
+            </w:r>
+          </w:p>
+        </w:tc>
+        <w:tc>
+          <w:tcPr>
+            <w:tcW w:type="dxa" w:w="3296"/>
+          </w:tcPr>
+          <w:p>
+            <w:r/>
+            <w:r>
+              <w:rPr>
+                <w:b w:val="0"/>
+                <w:i w:val="0"/>
+              </w:rPr>
+              <w:t>Semillas en que 2b supera al nivel 1</w:t>
+            </w:r>
+          </w:p>
+        </w:tc>
+        <w:tc>
+          <w:tcPr>
+            <w:tcW w:type="dxa" w:w="2020"/>
+          </w:tcPr>
+          <w:p>
+            <w:r/>
+            <w:r>
+              <w:rPr>
+                <w:b w:val="0"/>
+                <w:i w:val="0"/>
+              </w:rPr>
+              <w:t>10</w:t>
+            </w:r>
+          </w:p>
+        </w:tc>
+        <w:tc>
+          <w:tcPr>
+            <w:tcW w:type="dxa" w:w="3296"/>
+          </w:tcPr>
+          <w:p>
+            <w:r/>
+            <w:r>
+              <w:rPr>
+                <w:rFonts w:ascii="Menlo" w:hAnsi="Menlo"/>
+                <w:b w:val="0"/>
+                <w:i w:val="0"/>
+                <w:sz w:val="17"/>
+              </w:rPr>
+              <w:t>validacion-repetida.json</w:t>
+            </w:r>
+            <w:r>
+              <w:rPr>
+                <w:b w:val="0"/>
+                <w:i w:val="0"/>
+              </w:rPr>
+              <w:t xml:space="preserve"> → </w:t>
+            </w:r>
+            <w:r>
+              <w:rPr>
+                <w:rFonts w:ascii="Menlo" w:hAnsi="Menlo"/>
+                <w:b w:val="0"/>
+                <w:i w:val="0"/>
+                <w:sz w:val="17"/>
+              </w:rPr>
+              <w:t>comparacion_pareada_2b_menos_1.semillas_a_favor_de_2b</w:t>
+            </w:r>
+          </w:p>
+        </w:tc>
+      </w:tr>
+      <w:tr>
+        <w:tc>
+          <w:tcPr>
+            <w:tcW w:type="dxa" w:w="1037"/>
+          </w:tcPr>
+          <w:p>
+            <w:r/>
+            <w:r>
+              <w:rPr>
+                <w:b w:val="0"/>
+                <w:i w:val="0"/>
+              </w:rPr>
+              <w:t>T56</w:t>
+            </w:r>
+          </w:p>
+        </w:tc>
+        <w:tc>
+          <w:tcPr>
+            <w:tcW w:type="dxa" w:w="3296"/>
+          </w:tcPr>
+          <w:p>
+            <w:r/>
+            <w:r>
+              <w:rPr>
+                <w:b w:val="0"/>
+                <w:i w:val="0"/>
+              </w:rPr>
+              <w:t>Media y desviación de las 50 diferencias 2b − 1</w:t>
+            </w:r>
+          </w:p>
+        </w:tc>
+        <w:tc>
+          <w:tcPr>
+            <w:tcW w:type="dxa" w:w="2020"/>
+          </w:tcPr>
+          <w:p>
+            <w:r/>
+            <w:r>
+              <w:rPr>
+                <w:b w:val="0"/>
+                <w:i w:val="0"/>
+              </w:rPr>
+              <w:t>0.0125 / 0.0136</w:t>
+            </w:r>
+          </w:p>
+        </w:tc>
+        <w:tc>
+          <w:tcPr>
+            <w:tcW w:type="dxa" w:w="3296"/>
+          </w:tcPr>
+          <w:p>
+            <w:r/>
+            <w:r>
+              <w:rPr>
+                <w:rFonts w:ascii="Menlo" w:hAnsi="Menlo"/>
+                <w:b w:val="0"/>
+                <w:i w:val="0"/>
+                <w:sz w:val="17"/>
+              </w:rPr>
+              <w:t>validacion-repetida.json</w:t>
+            </w:r>
+            <w:r>
+              <w:rPr>
+                <w:b w:val="0"/>
+                <w:i w:val="0"/>
+              </w:rPr>
+              <w:t xml:space="preserve"> → </w:t>
+            </w:r>
+            <w:r>
+              <w:rPr>
+                <w:rFonts w:ascii="Menlo" w:hAnsi="Menlo"/>
+                <w:b w:val="0"/>
+                <w:i w:val="0"/>
+                <w:sz w:val="17"/>
+              </w:rPr>
+              <w:t>comparacion_pareada_2b_menos_1.media</w:t>
+            </w:r>
+            <w:r>
+              <w:rPr>
+                <w:b w:val="0"/>
+                <w:i w:val="0"/>
+              </w:rPr>
+              <w:t xml:space="preserve">, </w:t>
+            </w:r>
+            <w:r>
+              <w:rPr>
+                <w:rFonts w:ascii="Menlo" w:hAnsi="Menlo"/>
+                <w:b w:val="0"/>
+                <w:i w:val="0"/>
+                <w:sz w:val="17"/>
+              </w:rPr>
+              <w:t>.desviacion</w:t>
+            </w:r>
+          </w:p>
+        </w:tc>
+      </w:tr>
+      <w:tr>
+        <w:tc>
+          <w:tcPr>
+            <w:tcW w:type="dxa" w:w="1037"/>
+          </w:tcPr>
+          <w:p>
+            <w:r/>
+            <w:r>
+              <w:rPr>
+                <w:b w:val="0"/>
+                <w:i w:val="0"/>
+              </w:rPr>
+              <w:t>T57</w:t>
+            </w:r>
+          </w:p>
+        </w:tc>
+        <w:tc>
+          <w:tcPr>
+            <w:tcW w:type="dxa" w:w="3296"/>
+          </w:tcPr>
+          <w:p>
+            <w:r/>
+            <w:r>
+              <w:rPr>
+                <w:b w:val="0"/>
+                <w:i w:val="0"/>
+              </w:rPr>
+              <w:t xml:space="preserve">Intervalo </w:t>
+            </w:r>
+            <w:r>
+              <w:rPr>
+                <w:b w:val="0"/>
+                <w:i/>
+              </w:rPr>
+              <w:t>t</w:t>
+            </w:r>
+            <w:r>
+              <w:rPr>
+                <w:b w:val="0"/>
+                <w:i w:val="0"/>
+              </w:rPr>
+              <w:t xml:space="preserve"> al 95% ingenuo sobre las 50 diferencias</w:t>
+            </w:r>
+          </w:p>
+        </w:tc>
+        <w:tc>
+          <w:tcPr>
+            <w:tcW w:type="dxa" w:w="2020"/>
+          </w:tcPr>
+          <w:p>
+            <w:r/>
+            <w:r>
+              <w:rPr>
+                <w:b w:val="0"/>
+                <w:i w:val="0"/>
+              </w:rPr>
+              <w:t>0.0087 a 0.0164</w:t>
+            </w:r>
+          </w:p>
+        </w:tc>
+        <w:tc>
+          <w:tcPr>
+            <w:tcW w:type="dxa" w:w="3296"/>
+          </w:tcPr>
+          <w:p>
+            <w:r/>
+            <w:r>
+              <w:rPr>
+                <w:rFonts w:ascii="Menlo" w:hAnsi="Menlo"/>
+                <w:b w:val="0"/>
+                <w:i w:val="0"/>
+                <w:sz w:val="17"/>
+              </w:rPr>
+              <w:t>validacion-repetida.json</w:t>
+            </w:r>
+            <w:r>
+              <w:rPr>
+                <w:b w:val="0"/>
+                <w:i w:val="0"/>
+              </w:rPr>
+              <w:t xml:space="preserve"> → </w:t>
+            </w:r>
+            <w:r>
+              <w:rPr>
+                <w:rFonts w:ascii="Menlo" w:hAnsi="Menlo"/>
+                <w:b w:val="0"/>
+                <w:i w:val="0"/>
+                <w:sz w:val="17"/>
+              </w:rPr>
+              <w:t>comparacion_pareada_2b_menos_1.intervalo_t_95</w:t>
+            </w:r>
+          </w:p>
+        </w:tc>
+      </w:tr>
+      <w:tr>
+        <w:tc>
+          <w:tcPr>
+            <w:tcW w:type="dxa" w:w="1037"/>
+          </w:tcPr>
+          <w:p>
+            <w:r/>
+            <w:r>
+              <w:rPr>
+                <w:b w:val="0"/>
+                <w:i w:val="0"/>
+              </w:rPr>
+              <w:t>T58</w:t>
+            </w:r>
+          </w:p>
+        </w:tc>
+        <w:tc>
+          <w:tcPr>
+            <w:tcW w:type="dxa" w:w="3296"/>
+          </w:tcPr>
+          <w:p>
+            <w:r/>
+            <w:r>
+              <w:rPr>
+                <w:b w:val="0"/>
+                <w:i w:val="0"/>
+              </w:rPr>
+              <w:t xml:space="preserve">Intervalo </w:t>
+            </w:r>
+            <w:r>
+              <w:rPr>
+                <w:b w:val="0"/>
+                <w:i/>
+              </w:rPr>
+              <w:t>t</w:t>
+            </w:r>
+            <w:r>
+              <w:rPr>
+                <w:b w:val="0"/>
+                <w:i w:val="0"/>
+              </w:rPr>
+              <w:t xml:space="preserve"> al 95% corregido por Nadeau y Bengio</w:t>
+            </w:r>
+          </w:p>
+        </w:tc>
+        <w:tc>
+          <w:tcPr>
+            <w:tcW w:type="dxa" w:w="2020"/>
+          </w:tcPr>
+          <w:p>
+            <w:r/>
+            <w:r>
+              <w:rPr>
+                <w:b w:val="0"/>
+                <w:i w:val="0"/>
+              </w:rPr>
+              <w:t>−0.0017 a 0.0268</w:t>
+            </w:r>
+          </w:p>
+        </w:tc>
+        <w:tc>
+          <w:tcPr>
+            <w:tcW w:type="dxa" w:w="3296"/>
+          </w:tcPr>
+          <w:p>
+            <w:r/>
+            <w:r>
+              <w:rPr>
+                <w:rFonts w:ascii="Menlo" w:hAnsi="Menlo"/>
+                <w:b w:val="0"/>
+                <w:i w:val="0"/>
+                <w:sz w:val="17"/>
+              </w:rPr>
+              <w:t>validacion-repetida.json</w:t>
+            </w:r>
+            <w:r>
+              <w:rPr>
+                <w:b w:val="0"/>
+                <w:i w:val="0"/>
+              </w:rPr>
+              <w:t xml:space="preserve"> → </w:t>
+            </w:r>
+            <w:r>
+              <w:rPr>
+                <w:rFonts w:ascii="Menlo" w:hAnsi="Menlo"/>
+                <w:b w:val="0"/>
+                <w:i w:val="0"/>
+                <w:sz w:val="17"/>
+              </w:rPr>
+              <w:t>comparacion_pareada_2b_menos_1.intervalo_t_95_nadeau_bengio</w:t>
+            </w:r>
+          </w:p>
+        </w:tc>
+      </w:tr>
+      <w:tr>
+        <w:tc>
+          <w:tcPr>
+            <w:tcW w:type="dxa" w:w="1037"/>
+          </w:tcPr>
+          <w:p>
+            <w:r/>
+            <w:r>
+              <w:rPr>
+                <w:b w:val="0"/>
+                <w:i w:val="0"/>
+              </w:rPr>
+              <w:t>T59</w:t>
+            </w:r>
+          </w:p>
+        </w:tc>
+        <w:tc>
+          <w:tcPr>
+            <w:tcW w:type="dxa" w:w="3296"/>
+          </w:tcPr>
+          <w:p>
+            <w:r/>
+            <w:r>
+              <w:rPr>
+                <w:b w:val="0"/>
+                <w:i w:val="0"/>
+              </w:rPr>
+              <w:t>AUC estándar medio del nivel 2a</w:t>
+            </w:r>
+          </w:p>
+        </w:tc>
+        <w:tc>
+          <w:tcPr>
+            <w:tcW w:type="dxa" w:w="2020"/>
+          </w:tcPr>
+          <w:p>
+            <w:r/>
+            <w:r>
+              <w:rPr>
+                <w:b w:val="0"/>
+                <w:i w:val="0"/>
+              </w:rPr>
+              <w:t>0.6159</w:t>
+            </w:r>
+          </w:p>
+        </w:tc>
+        <w:tc>
+          <w:tcPr>
+            <w:tcW w:type="dxa" w:w="3296"/>
+          </w:tcPr>
+          <w:p>
+            <w:r/>
+            <w:r>
+              <w:rPr>
+                <w:rFonts w:ascii="Menlo" w:hAnsi="Menlo"/>
+                <w:b w:val="0"/>
+                <w:i w:val="0"/>
+                <w:sz w:val="17"/>
+              </w:rPr>
+              <w:t>modelado-baseline.json</w:t>
+            </w:r>
+            <w:r>
+              <w:rPr>
+                <w:b w:val="0"/>
+                <w:i w:val="0"/>
+              </w:rPr>
+              <w:t xml:space="preserve"> → </w:t>
+            </w:r>
+            <w:r>
+              <w:rPr>
+                <w:rFonts w:ascii="Menlo" w:hAnsi="Menlo"/>
+                <w:b w:val="0"/>
+                <w:i w:val="0"/>
+                <w:sz w:val="17"/>
+              </w:rPr>
+              <w:t>nivel_2a_....auc_estandar_media</w:t>
+            </w:r>
+          </w:p>
+        </w:tc>
+      </w:tr>
+      <w:tr>
+        <w:tc>
+          <w:tcPr>
+            <w:tcW w:type="dxa" w:w="1037"/>
+          </w:tcPr>
+          <w:p>
+            <w:r/>
+            <w:r>
+              <w:rPr>
+                <w:b w:val="0"/>
+                <w:i w:val="0"/>
+              </w:rPr>
+              <w:t>T60</w:t>
+            </w:r>
+          </w:p>
+        </w:tc>
+        <w:tc>
+          <w:tcPr>
+            <w:tcW w:type="dxa" w:w="3296"/>
+          </w:tcPr>
+          <w:p>
+            <w:r/>
+            <w:r>
+              <w:rPr>
+                <w:b w:val="0"/>
+                <w:i w:val="0"/>
+              </w:rPr>
+              <w:t>AUC estándar medio de los niveles 1 y 2b</w:t>
+            </w:r>
+          </w:p>
+        </w:tc>
+        <w:tc>
+          <w:tcPr>
+            <w:tcW w:type="dxa" w:w="2020"/>
+          </w:tcPr>
+          <w:p>
+            <w:r/>
+            <w:r>
+              <w:rPr>
+                <w:b w:val="0"/>
+                <w:i w:val="0"/>
+              </w:rPr>
+              <w:t>0.9013 / 0.93</w:t>
+            </w:r>
+          </w:p>
+        </w:tc>
+        <w:tc>
+          <w:tcPr>
+            <w:tcW w:type="dxa" w:w="3296"/>
+          </w:tcPr>
+          <w:p>
+            <w:r/>
+            <w:r>
+              <w:rPr>
+                <w:rFonts w:ascii="Menlo" w:hAnsi="Menlo"/>
+                <w:b w:val="0"/>
+                <w:i w:val="0"/>
+                <w:sz w:val="17"/>
+              </w:rPr>
+              <w:t>modelado-baseline.json</w:t>
+            </w:r>
+            <w:r>
+              <w:rPr>
+                <w:b w:val="0"/>
+                <w:i w:val="0"/>
+              </w:rPr>
+              <w:t xml:space="preserve"> → </w:t>
+            </w:r>
+            <w:r>
+              <w:rPr>
+                <w:rFonts w:ascii="Menlo" w:hAnsi="Menlo"/>
+                <w:b w:val="0"/>
+                <w:i w:val="0"/>
+                <w:sz w:val="17"/>
+              </w:rPr>
+              <w:t>nivel_1_....auc_estandar_media</w:t>
+            </w:r>
+            <w:r>
+              <w:rPr>
+                <w:b w:val="0"/>
+                <w:i w:val="0"/>
+              </w:rPr>
+              <w:t xml:space="preserve">, </w:t>
+            </w:r>
+            <w:r>
+              <w:rPr>
+                <w:rFonts w:ascii="Menlo" w:hAnsi="Menlo"/>
+                <w:b w:val="0"/>
+                <w:i w:val="0"/>
+                <w:sz w:val="17"/>
+              </w:rPr>
+              <w:t>nivel_2b_....auc_estandar_media</w:t>
+            </w:r>
+          </w:p>
+        </w:tc>
+      </w:tr>
+      <w:tr>
+        <w:tc>
+          <w:tcPr>
+            <w:tcW w:type="dxa" w:w="1037"/>
+          </w:tcPr>
+          <w:p>
+            <w:r/>
+            <w:r>
+              <w:rPr>
+                <w:b w:val="0"/>
+                <w:i w:val="0"/>
+              </w:rPr>
+              <w:t>T61</w:t>
+            </w:r>
+          </w:p>
+        </w:tc>
+        <w:tc>
+          <w:tcPr>
+            <w:tcW w:type="dxa" w:w="3296"/>
+          </w:tcPr>
+          <w:p>
+            <w:r/>
+            <w:r>
+              <w:rPr>
+                <w:b w:val="0"/>
+                <w:i w:val="0"/>
+              </w:rPr>
+              <w:t>AUC estándar del nivel 2a en cada fold</w:t>
+            </w:r>
+          </w:p>
+        </w:tc>
+        <w:tc>
+          <w:tcPr>
+            <w:tcW w:type="dxa" w:w="2020"/>
+          </w:tcPr>
+          <w:p>
+            <w:r/>
+            <w:r>
+              <w:rPr>
+                <w:b w:val="0"/>
+                <w:i w:val="0"/>
+              </w:rPr>
+              <w:t>0.6685, 0.7095, 0.5208, 0.6174, 0.5632</w:t>
+            </w:r>
+          </w:p>
+        </w:tc>
+        <w:tc>
+          <w:tcPr>
+            <w:tcW w:type="dxa" w:w="3296"/>
+          </w:tcPr>
+          <w:p>
+            <w:r/>
+            <w:r>
+              <w:rPr>
+                <w:rFonts w:ascii="Menlo" w:hAnsi="Menlo"/>
+                <w:b w:val="0"/>
+                <w:i w:val="0"/>
+                <w:sz w:val="17"/>
+              </w:rPr>
+              <w:t>modelado-baseline.json</w:t>
+            </w:r>
+            <w:r>
+              <w:rPr>
+                <w:b w:val="0"/>
+                <w:i w:val="0"/>
+              </w:rPr>
+              <w:t xml:space="preserve"> → </w:t>
+            </w:r>
+            <w:r>
+              <w:rPr>
+                <w:rFonts w:ascii="Menlo" w:hAnsi="Menlo"/>
+                <w:b w:val="0"/>
+                <w:i w:val="0"/>
+                <w:sz w:val="17"/>
+              </w:rPr>
+              <w:t>nivel_2a_....auc_estandar_por_fold</w:t>
+            </w:r>
+          </w:p>
+        </w:tc>
+      </w:tr>
+      <w:tr>
+        <w:tc>
+          <w:tcPr>
+            <w:tcW w:type="dxa" w:w="1037"/>
+          </w:tcPr>
+          <w:p>
+            <w:r/>
+            <w:r>
+              <w:rPr>
+                <w:b w:val="0"/>
+                <w:i w:val="0"/>
+              </w:rPr>
+              <w:t>T62</w:t>
+            </w:r>
+          </w:p>
+        </w:tc>
+        <w:tc>
+          <w:tcPr>
+            <w:tcW w:type="dxa" w:w="3296"/>
+          </w:tcPr>
+          <w:p>
+            <w:r/>
+            <w:r>
+              <w:rPr>
+                <w:b w:val="0"/>
+                <w:i w:val="0"/>
+              </w:rPr>
+              <w:t>Las escalas del AUC y del pAUC tienen azares distintos y no son comparables entre sí</w:t>
+            </w:r>
+          </w:p>
+        </w:tc>
+        <w:tc>
+          <w:tcPr>
+            <w:tcW w:type="dxa" w:w="2020"/>
+          </w:tcPr>
+          <w:p>
+            <w:r/>
+            <w:r>
+              <w:rPr>
+                <w:b w:val="0"/>
+                <w:i w:val="0"/>
+              </w:rPr>
+              <w:t>—</w:t>
+            </w:r>
+          </w:p>
+        </w:tc>
+        <w:tc>
+          <w:tcPr>
+            <w:tcW w:type="dxa" w:w="3296"/>
+          </w:tcPr>
+          <w:p>
+            <w:r/>
+            <w:r>
+              <w:rPr>
+                <w:rFonts w:ascii="Menlo" w:hAnsi="Menlo"/>
+                <w:b w:val="0"/>
+                <w:i w:val="0"/>
+                <w:sz w:val="17"/>
+              </w:rPr>
+              <w:t>modelado-baseline.json</w:t>
+            </w:r>
+            <w:r>
+              <w:rPr>
+                <w:b w:val="0"/>
+                <w:i w:val="0"/>
+              </w:rPr>
+              <w:t xml:space="preserve"> → </w:t>
+            </w:r>
+            <w:r>
+              <w:rPr>
+                <w:rFonts w:ascii="Menlo" w:hAnsi="Menlo"/>
+                <w:b w:val="0"/>
+                <w:i w:val="0"/>
+                <w:sz w:val="17"/>
+              </w:rPr>
+              <w:t>nivel_0_....nota</w:t>
             </w:r>
           </w:p>
         </w:tc>
@@ -11022,7 +13065,7 @@
           <w:b w:val="0"/>
           <w:i w:val="0"/>
         </w:rPr>
-        <w:t>10.3 Cifras deliberadamente ausentes</w:t>
+        <w:t>10.3 Cifras que estaban ausentes y ya no lo están</w:t>
       </w:r>
     </w:p>
     <w:p>
@@ -11034,7 +13077,7 @@
           <w:b w:val="0"/>
           <w:i w:val="0"/>
         </w:rPr>
-        <w:t xml:space="preserve">Dos números que aparecerían de forma natural en la sección 7 no se citan, porque proceden de un diagnóstico auxiliar y no están en ningún archivo de </w:t>
+        <w:t xml:space="preserve">Una versión anterior de este anexo declaraba dos números deliberadamente ausentes: el AUC convencional de los niveles 2a y 2b. Procedían de un diagnóstico auxiliar, no estaban en ningún archivo de </w:t>
       </w:r>
       <w:r>
         <w:rPr>
@@ -11050,7 +13093,7 @@
           <w:b w:val="0"/>
           <w:i w:val="0"/>
         </w:rPr>
-        <w:t xml:space="preserve">: el AUC convencional de los niveles 2a y 2b. La regla de trazabilidad no admite excepciones por conveniencia narrativa. Se señala como mejora pendiente del instrumento </w:t>
+        <w:t xml:space="preserve">, y la regla de trazabilidad no admite excepciones por conveniencia narrativa — así que el contraste entre métricas de la sección 7.3 hubo de argumentarse en términos cualitativos. Se anotó entonces como mejora pendiente del instrumento </w:t>
       </w:r>
       <w:r>
         <w:rPr>
@@ -11066,7 +13109,189 @@
           <w:b w:val="0"/>
           <w:i w:val="0"/>
         </w:rPr>
-        <w:t>: si el AUC estándar de cada nivel se incorporara a su salida, el contraste entre métricas podría argumentarse con cifras en vez de en términos cualitativos.</w:t>
+        <w:t>.</w:t>
+      </w:r>
+    </w:p>
+    <w:p>
+      <w:pPr>
+        <w:jc w:val="both"/>
+      </w:pPr>
+      <w:r>
+        <w:rPr>
+          <w:b w:val="0"/>
+          <w:i w:val="0"/>
+        </w:rPr>
+        <w:t xml:space="preserve">La mejora se implementó. El AUC estándar de cada nivel está hoy en </w:t>
+      </w:r>
+      <w:r>
+        <w:rPr>
+          <w:rFonts w:ascii="Menlo" w:hAnsi="Menlo"/>
+          <w:b w:val="0"/>
+          <w:i w:val="0"/>
+          <w:sz w:val="19"/>
+        </w:rPr>
+        <w:t>modelado-baseline.json</w:t>
+      </w:r>
+      <w:r>
+        <w:rPr>
+          <w:b w:val="0"/>
+          <w:i w:val="0"/>
+        </w:rPr>
+        <w:t xml:space="preserve"> → </w:t>
+      </w:r>
+      <w:r>
+        <w:rPr>
+          <w:rFonts w:ascii="Menlo" w:hAnsi="Menlo"/>
+          <w:b w:val="0"/>
+          <w:i w:val="0"/>
+          <w:sz w:val="19"/>
+        </w:rPr>
+        <w:t>nivel_*.auc_estandar_media</w:t>
+      </w:r>
+      <w:r>
+        <w:rPr>
+          <w:b w:val="0"/>
+          <w:i w:val="0"/>
+        </w:rPr>
+        <w:t xml:space="preserve"> y </w:t>
+      </w:r>
+      <w:r>
+        <w:rPr>
+          <w:rFonts w:ascii="Menlo" w:hAnsi="Menlo"/>
+          <w:b w:val="0"/>
+          <w:i w:val="0"/>
+          <w:sz w:val="19"/>
+        </w:rPr>
+        <w:t>nivel_*.auc_estandar_por_fold</w:t>
+      </w:r>
+      <w:r>
+        <w:rPr>
+          <w:b w:val="0"/>
+          <w:i w:val="0"/>
+        </w:rPr>
+        <w:t xml:space="preserve"> </w:t>
+      </w:r>
+      <w:r>
+        <w:rPr>
+          <w:rFonts w:ascii="Menlo" w:hAnsi="Menlo"/>
+          <w:b w:val="0"/>
+          <w:i w:val="0"/>
+          <w:sz w:val="19"/>
+        </w:rPr>
+        <w:t>[T59]</w:t>
+      </w:r>
+      <w:r>
+        <w:rPr>
+          <w:b w:val="0"/>
+          <w:i w:val="0"/>
+        </w:rPr>
+        <w:t xml:space="preserve"> </w:t>
+      </w:r>
+      <w:r>
+        <w:rPr>
+          <w:rFonts w:ascii="Menlo" w:hAnsi="Menlo"/>
+          <w:b w:val="0"/>
+          <w:i w:val="0"/>
+          <w:sz w:val="19"/>
+        </w:rPr>
+        <w:t>[T60]</w:t>
+      </w:r>
+      <w:r>
+        <w:rPr>
+          <w:b w:val="0"/>
+          <w:i w:val="0"/>
+        </w:rPr>
+        <w:t xml:space="preserve"> </w:t>
+      </w:r>
+      <w:r>
+        <w:rPr>
+          <w:rFonts w:ascii="Menlo" w:hAnsi="Menlo"/>
+          <w:b w:val="0"/>
+          <w:i w:val="0"/>
+          <w:sz w:val="19"/>
+        </w:rPr>
+        <w:t>[T61]</w:t>
+      </w:r>
+      <w:r>
+        <w:rPr>
+          <w:b w:val="0"/>
+          <w:i w:val="0"/>
+        </w:rPr>
+        <w:t>, y el contraste se argumenta con cifras.</w:t>
+      </w:r>
+    </w:p>
+    <w:p>
+      <w:pPr>
+        <w:jc w:val="both"/>
+      </w:pPr>
+      <w:r>
+        <w:rPr>
+          <w:b w:val="0"/>
+          <w:i w:val="0"/>
+        </w:rPr>
+        <w:t xml:space="preserve">Queda el registro de un defecto que esa medición hizo visible. Mientras el valor no existía, un AUC de 0,6685 llegó a atribuirse al nivel 2a en su conjunto; se retiró al verificar que no tenía respaldo en </w:t>
+      </w:r>
+      <w:r>
+        <w:rPr>
+          <w:rFonts w:ascii="Menlo" w:hAnsi="Menlo"/>
+          <w:b w:val="0"/>
+          <w:i w:val="0"/>
+          <w:sz w:val="19"/>
+        </w:rPr>
+        <w:t>outputs/</w:t>
+      </w:r>
+      <w:r>
+        <w:rPr>
+          <w:b w:val="0"/>
+          <w:i w:val="0"/>
+        </w:rPr>
+        <w:t xml:space="preserve">. Medido ya el AUC por fold, resulta que 0,6685 es el del </w:t>
+      </w:r>
+      <w:r>
+        <w:rPr>
+          <w:b/>
+          <w:i w:val="0"/>
+        </w:rPr>
+        <w:t>primer fold</w:t>
+      </w:r>
+      <w:r>
+        <w:rPr>
+          <w:b w:val="0"/>
+          <w:i w:val="0"/>
+        </w:rPr>
+        <w:t xml:space="preserve"> </w:t>
+      </w:r>
+      <w:r>
+        <w:rPr>
+          <w:rFonts w:ascii="Menlo" w:hAnsi="Menlo"/>
+          <w:b w:val="0"/>
+          <w:i w:val="0"/>
+          <w:sz w:val="19"/>
+        </w:rPr>
+        <w:t>[T61]</w:t>
+      </w:r>
+      <w:r>
+        <w:rPr>
+          <w:b w:val="0"/>
+          <w:i w:val="0"/>
+        </w:rPr>
+        <w:t xml:space="preserve">, no el del modelo, cuyo valor es 0,6159 </w:t>
+      </w:r>
+      <w:r>
+        <w:rPr>
+          <w:rFonts w:ascii="Menlo" w:hAnsi="Menlo"/>
+          <w:b w:val="0"/>
+          <w:i w:val="0"/>
+          <w:sz w:val="19"/>
+        </w:rPr>
+        <w:t>[T59]</w:t>
+      </w:r>
+      <w:r>
+        <w:rPr>
+          <w:b w:val="0"/>
+          <w:i w:val="0"/>
+        </w:rPr>
+        <w:t>. El número era real y estaba mal atribuido: ése es exactamente el modo de fallo que la regla de trazabilidad existe para atrapar, y la verificación lo atrapó sin necesidad de que nadie recordara de dónde había salido la cifra.</w:t>
       </w:r>
     </w:p>
     <w:p>
@@ -11099,7 +13324,7 @@
           <w:b w:val="0"/>
           <w:i w:val="0"/>
         </w:rPr>
-        <w:t xml:space="preserve"> compara todo número del informe contra los valores presentes en </w:t>
+        <w:t xml:space="preserve"> extrae todo número de este borrador y comprueba que tenga respaldo en </w:t>
       </w:r>
       <w:r>
         <w:rPr>
@@ -11115,7 +13340,19 @@
           <w:b w:val="0"/>
           <w:i w:val="0"/>
         </w:rPr>
-        <w:t xml:space="preserve">. Señaló siete sin respaldo exacto. Dos eran defectos reales del borrador y se corrigieron: un promedio redondeado a "casi 385" cuando la cifra medida es 384,89 </w:t>
+        <w:t>. Lo que el verificador señala no es una lista de errores: es una lista de cosas que un humano tiene que mirar. Esta sección es ese examen, hecho una por una.</w:t>
+      </w:r>
+    </w:p>
+    <w:p>
+      <w:pPr>
+        <w:jc w:val="both"/>
+      </w:pPr>
+      <w:r>
+        <w:rPr>
+          <w:b w:val="0"/>
+          <w:i w:val="0"/>
+        </w:rPr>
+        <w:t xml:space="preserve">Dos señalamientos fueron defectos reales del borrador y se corrigieron: un promedio redondeado a "casi 385" cuando la cifra medida es 384,89 </w:t>
       </w:r>
       <w:r>
         <w:rPr>
@@ -11147,7 +13384,93 @@
           <w:b w:val="0"/>
           <w:i w:val="0"/>
         </w:rPr>
-        <w:t>. Los cinco restantes se justifican:</w:t>
+        <w:t>.</w:t>
+      </w:r>
+    </w:p>
+    <w:p>
+      <w:pPr>
+        <w:jc w:val="both"/>
+      </w:pPr>
+      <w:r>
+        <w:rPr>
+          <w:b w:val="0"/>
+          <w:i w:val="0"/>
+        </w:rPr>
+        <w:t xml:space="preserve">Los porcentajes que el informe usa como </w:t>
+      </w:r>
+      <w:r>
+        <w:rPr>
+          <w:b/>
+          <w:i w:val="0"/>
+        </w:rPr>
+        <w:t>parámetros del método</w:t>
+      </w:r>
+      <w:r>
+        <w:rPr>
+          <w:b w:val="0"/>
+          <w:i w:val="0"/>
+        </w:rPr>
+        <w:t xml:space="preserve"> y no como mediciones —el umbral de sensibilidad del pAUC </w:t>
+      </w:r>
+      <w:r>
+        <w:rPr>
+          <w:rFonts w:ascii="Menlo" w:hAnsi="Menlo"/>
+          <w:b w:val="0"/>
+          <w:i w:val="0"/>
+          <w:sz w:val="19"/>
+        </w:rPr>
+        <w:t>[E1]</w:t>
+      </w:r>
+      <w:r>
+        <w:rPr>
+          <w:b w:val="0"/>
+          <w:i w:val="0"/>
+        </w:rPr>
+        <w:t xml:space="preserve">, el umbral rival del esquema de premios </w:t>
+      </w:r>
+      <w:r>
+        <w:rPr>
+          <w:rFonts w:ascii="Menlo" w:hAnsi="Menlo"/>
+          <w:b w:val="0"/>
+          <w:i w:val="0"/>
+          <w:sz w:val="19"/>
+        </w:rPr>
+        <w:t>[E7]</w:t>
+      </w:r>
+      <w:r>
+        <w:rPr>
+          <w:b w:val="0"/>
+          <w:i w:val="0"/>
+        </w:rPr>
+        <w:t xml:space="preserve">, el nivel de confianza de los intervalos— los excluye el verificador por una lista declarada, y los reporta aparte en </w:t>
+      </w:r>
+      <w:r>
+        <w:rPr>
+          <w:rFonts w:ascii="Menlo" w:hAnsi="Menlo"/>
+          <w:b w:val="0"/>
+          <w:i w:val="0"/>
+          <w:sz w:val="19"/>
+        </w:rPr>
+        <w:t>porcentajes_de_metodo_excluidos</w:t>
+      </w:r>
+      <w:r>
+        <w:rPr>
+          <w:b w:val="0"/>
+          <w:i w:val="0"/>
+        </w:rPr>
+        <w:t>. No se cuentan como señalados porque el informe no los afirma como resultados propios.</w:t>
+      </w:r>
+    </w:p>
+    <w:p>
+      <w:pPr>
+        <w:jc w:val="both"/>
+      </w:pPr>
+      <w:r>
+        <w:rPr>
+          <w:b w:val="0"/>
+          <w:i w:val="0"/>
+        </w:rPr>
+        <w:t>Los que quedan señalados, y por qué:</w:t>
       </w:r>
     </w:p>
     <w:tbl>
@@ -11242,7 +13565,7 @@
                 <w:b w:val="0"/>
                 <w:i w:val="0"/>
               </w:rPr>
-              <w:t>44%</w:t>
+              <w:t>15 líneas</w:t>
             </w:r>
           </w:p>
         </w:tc>
@@ -11257,7 +13580,7 @@
                 <w:b w:val="0"/>
                 <w:i w:val="0"/>
               </w:rPr>
-              <w:t>7.1</w:t>
+              <w:t>§3.1</w:t>
             </w:r>
           </w:p>
         </w:tc>
@@ -11272,7 +13595,7 @@
                 <w:b w:val="0"/>
                 <w:i w:val="0"/>
               </w:rPr>
-              <w:t xml:space="preserve">Derivación ilustrativa, no un resultado: es dónde caería un pAUC hipotético de 0,10 en el recorrido azar→perfecto, calculada a partir de </w:t>
+              <w:t xml:space="preserve">Restricción de diseño de las skills, fijada en </w:t>
             </w:r>
             <w:r>
               <w:rPr>
@@ -11281,30 +13604,14 @@
                 <w:i w:val="0"/>
                 <w:sz w:val="17"/>
               </w:rPr>
-              <w:t>[T33]</w:t>
-            </w:r>
-            <w:r>
-              <w:rPr>
-                <w:b w:val="0"/>
-                <w:i w:val="0"/>
-              </w:rPr>
-              <w:t xml:space="preserve"> y </w:t>
-            </w:r>
-            <w:r>
-              <w:rPr>
-                <w:rFonts w:ascii="Menlo" w:hAnsi="Menlo"/>
-                <w:b w:val="0"/>
-                <w:i w:val="0"/>
-                <w:sz w:val="17"/>
-              </w:rPr>
-              <w:t>[T34]</w:t>
-            </w:r>
-            <w:r>
-              <w:rPr>
-                <w:b w:val="0"/>
-                <w:i w:val="0"/>
-              </w:rPr>
-              <w:t>. Ningún modelo del proyecto obtuvo ese valor.</w:t>
+              <w:t>CLAUDE.md</w:t>
+            </w:r>
+            <w:r>
+              <w:rPr>
+                <w:b w:val="0"/>
+                <w:i w:val="0"/>
+              </w:rPr>
+              <w:t>. Es una regla del proyecto, no una magnitud medida: ningún script la produce.</w:t>
             </w:r>
           </w:p>
         </w:tc>
@@ -11321,7 +13628,7 @@
                 <w:b w:val="0"/>
                 <w:i w:val="0"/>
               </w:rPr>
-              <w:t>33,8% (×3)</w:t>
+              <w:t>200 casos</w:t>
             </w:r>
           </w:p>
         </w:tc>
@@ -11336,7 +13643,7 @@
                 <w:b w:val="0"/>
                 <w:i w:val="0"/>
               </w:rPr>
-              <w:t>7.2, 7.3, 9</w:t>
+              <w:t>§3.4</w:t>
             </w:r>
           </w:p>
         </w:tc>
@@ -11351,7 +13658,7 @@
                 <w:b w:val="0"/>
                 <w:i w:val="0"/>
               </w:rPr>
-              <w:t xml:space="preserve">Está en </w:t>
+              <w:t xml:space="preserve">Tamaño de la comprobación de la métrica contra el script del organizador </w:t>
             </w:r>
             <w:r>
               <w:rPr>
@@ -11360,94 +13667,14 @@
                 <w:i w:val="0"/>
                 <w:sz w:val="17"/>
               </w:rPr>
-              <w:t>outputs/modelado-baseline.md</w:t>
-            </w:r>
-            <w:r>
-              <w:rPr>
-                <w:b w:val="0"/>
-                <w:i w:val="0"/>
-              </w:rPr>
-              <w:t xml:space="preserve">, no en el </w:t>
-            </w:r>
-            <w:r>
-              <w:rPr>
-                <w:rFonts w:ascii="Menlo" w:hAnsi="Menlo"/>
-                <w:b w:val="0"/>
-                <w:i w:val="0"/>
-                <w:sz w:val="17"/>
-              </w:rPr>
-              <w:t>.json</w:t>
-            </w:r>
-            <w:r>
-              <w:rPr>
-                <w:b w:val="0"/>
-                <w:i w:val="0"/>
-              </w:rPr>
-              <w:t xml:space="preserve">: el porcentaje del recorrido lo calcula el instrumento al redactar su resumen. El script solo lee archivos </w:t>
-            </w:r>
-            <w:r>
-              <w:rPr>
-                <w:rFonts w:ascii="Menlo" w:hAnsi="Menlo"/>
-                <w:b w:val="0"/>
-                <w:i w:val="0"/>
-                <w:sz w:val="17"/>
-              </w:rPr>
-              <w:t>.json</w:t>
-            </w:r>
-            <w:r>
-              <w:rPr>
-                <w:b w:val="0"/>
-                <w:i w:val="0"/>
-              </w:rPr>
-              <w:t xml:space="preserve">, y esa es una limitación suya, no una cifra sin origen. Es reproducible desde </w:t>
-            </w:r>
-            <w:r>
-              <w:rPr>
-                <w:rFonts w:ascii="Menlo" w:hAnsi="Menlo"/>
-                <w:b w:val="0"/>
-                <w:i w:val="0"/>
-                <w:sz w:val="17"/>
-              </w:rPr>
-              <w:t>[T35]</w:t>
-            </w:r>
-            <w:r>
-              <w:rPr>
-                <w:b w:val="0"/>
-                <w:i w:val="0"/>
-              </w:rPr>
-              <w:t xml:space="preserve">, </w:t>
-            </w:r>
-            <w:r>
-              <w:rPr>
-                <w:rFonts w:ascii="Menlo" w:hAnsi="Menlo"/>
-                <w:b w:val="0"/>
-                <w:i w:val="0"/>
-                <w:sz w:val="17"/>
-              </w:rPr>
-              <w:t>[T33]</w:t>
-            </w:r>
-            <w:r>
-              <w:rPr>
-                <w:b w:val="0"/>
-                <w:i w:val="0"/>
-              </w:rPr>
-              <w:t xml:space="preserve"> y </w:t>
-            </w:r>
-            <w:r>
-              <w:rPr>
-                <w:rFonts w:ascii="Menlo" w:hAnsi="Menlo"/>
-                <w:b w:val="0"/>
-                <w:i w:val="0"/>
-                <w:sz w:val="17"/>
-              </w:rPr>
-              <w:t>[T34]</w:t>
-            </w:r>
-            <w:r>
-              <w:rPr>
-                <w:b w:val="0"/>
-                <w:i w:val="0"/>
-              </w:rPr>
-              <w:t>.</w:t>
+              <w:t>[E3]</w:t>
+            </w:r>
+            <w:r>
+              <w:rPr>
+                <w:b w:val="0"/>
+                <w:i w:val="0"/>
+              </w:rPr>
+              <w:t>. Es un detalle del procedimiento de verificación, no un resultado del modelado.</w:t>
             </w:r>
           </w:p>
         </w:tc>
@@ -11464,7 +13691,7 @@
                 <w:b w:val="0"/>
                 <w:i w:val="0"/>
               </w:rPr>
-              <w:t>88%</w:t>
+              <w:t>80/20</w:t>
             </w:r>
           </w:p>
         </w:tc>
@@ -11479,7 +13706,7 @@
                 <w:b w:val="0"/>
                 <w:i w:val="0"/>
               </w:rPr>
-              <w:t>8, punto 6</w:t>
+              <w:t>§5.3</w:t>
             </w:r>
           </w:p>
         </w:tc>
@@ -11494,23 +13721,21 @@
                 <w:b w:val="0"/>
                 <w:i w:val="0"/>
               </w:rPr>
-              <w:t xml:space="preserve">Externa por naturaleza: es el umbral del esquema de premios del organizador, no un resultado de este proyecto. Trazable a </w:t>
-            </w:r>
-            <w:r>
-              <w:rPr>
-                <w:rFonts w:ascii="Menlo" w:hAnsi="Menlo"/>
-                <w:b w:val="0"/>
-                <w:i w:val="0"/>
-                <w:sz w:val="17"/>
-              </w:rPr>
-              <w:t>[E7]</w:t>
-            </w:r>
-            <w:r>
-              <w:rPr>
-                <w:b w:val="0"/>
-                <w:i w:val="0"/>
-              </w:rPr>
-              <w:t>.</w:t>
+              <w:t xml:space="preserve">Proporción de la partición aleatoria que el instrumento corre </w:t>
+            </w:r>
+            <w:r>
+              <w:rPr>
+                <w:b/>
+                <w:i w:val="0"/>
+              </w:rPr>
+              <w:t>para mostrar que no debe usarse</w:t>
+            </w:r>
+            <w:r>
+              <w:rPr>
+                <w:b w:val="0"/>
+                <w:i w:val="0"/>
+              </w:rPr>
+              <w:t>. Es la convención de tutorial que la sección critica, no un parámetro del diseño adoptado.</w:t>
             </w:r>
           </w:p>
         </w:tc>
@@ -11527,7 +13752,7 @@
                 <w:b w:val="0"/>
                 <w:i w:val="0"/>
               </w:rPr>
-              <w:t>95%</w:t>
+              <w:t>57.000 lesiones</w:t>
             </w:r>
           </w:p>
         </w:tc>
@@ -11542,7 +13767,7 @@
                 <w:b w:val="0"/>
                 <w:i w:val="0"/>
               </w:rPr>
-              <w:t>7.4</w:t>
+              <w:t>§6.3</w:t>
             </w:r>
           </w:p>
         </w:tc>
@@ -11557,7 +13782,23 @@
                 <w:b w:val="0"/>
                 <w:i w:val="0"/>
               </w:rPr>
-              <w:t>Nivel de confianza convencional del intervalo, no una magnitud medida.</w:t>
+              <w:t xml:space="preserve">Cifra externa, del artículo que describe la metadata </w:t>
+            </w:r>
+            <w:r>
+              <w:rPr>
+                <w:rFonts w:ascii="Menlo" w:hAnsi="Menlo"/>
+                <w:b w:val="0"/>
+                <w:i w:val="0"/>
+                <w:sz w:val="17"/>
+              </w:rPr>
+              <w:t>[E5]</w:t>
+            </w:r>
+            <w:r>
+              <w:rPr>
+                <w:b w:val="0"/>
+                <w:i w:val="0"/>
+              </w:rPr>
+              <w:t>, citada dentro de un supuesto declarado. No procede de este proyecto.</w:t>
             </w:r>
           </w:p>
         </w:tc>
@@ -11574,21 +13815,7 @@
                 <w:b w:val="0"/>
                 <w:i w:val="0"/>
               </w:rPr>
-              <w:t xml:space="preserve">Diferencias por fold, su media (0,0120), su desviación (0,0160) y el intervalo </w:t>
-            </w:r>
-            <w:r>
-              <w:rPr>
-                <w:b w:val="0"/>
-                <w:i/>
-              </w:rPr>
-              <w:t>t</w:t>
-            </w:r>
-            <w:r>
-              <w:rPr>
-                <w:b w:val="0"/>
-                <w:i w:val="0"/>
-              </w:rPr>
-              <w:t xml:space="preserve"> (−0,008 a +0,032)</w:t>
+              <w:t>0,44</w:t>
             </w:r>
           </w:p>
         </w:tc>
@@ -11603,7 +13830,7 @@
                 <w:b w:val="0"/>
                 <w:i w:val="0"/>
               </w:rPr>
-              <w:t>7.4</w:t>
+              <w:t>§7.1</w:t>
             </w:r>
           </w:p>
         </w:tc>
@@ -11618,6 +13845,176 @@
                 <w:b w:val="0"/>
                 <w:i w:val="0"/>
               </w:rPr>
+              <w:t xml:space="preserve">Derivación ilustrativa: es dónde caería en la escala un pAUC hipotético de 0,10, calculada desde </w:t>
+            </w:r>
+            <w:r>
+              <w:rPr>
+                <w:rFonts w:ascii="Menlo" w:hAnsi="Menlo"/>
+                <w:b w:val="0"/>
+                <w:i w:val="0"/>
+                <w:sz w:val="17"/>
+              </w:rPr>
+              <w:t>[T33]</w:t>
+            </w:r>
+            <w:r>
+              <w:rPr>
+                <w:b w:val="0"/>
+                <w:i w:val="0"/>
+              </w:rPr>
+              <w:t xml:space="preserve"> y </w:t>
+            </w:r>
+            <w:r>
+              <w:rPr>
+                <w:rFonts w:ascii="Menlo" w:hAnsi="Menlo"/>
+                <w:b w:val="0"/>
+                <w:i w:val="0"/>
+                <w:sz w:val="17"/>
+              </w:rPr>
+              <w:t>[T34]</w:t>
+            </w:r>
+            <w:r>
+              <w:rPr>
+                <w:b w:val="0"/>
+                <w:i w:val="0"/>
+              </w:rPr>
+              <w:t>. Ningún modelo del proyecto obtuvo ese valor.</w:t>
+            </w:r>
+          </w:p>
+        </w:tc>
+      </w:tr>
+      <w:tr>
+        <w:tc>
+          <w:tcPr>
+            <w:tcW w:type="dxa" w:w="4306"/>
+          </w:tcPr>
+          <w:p>
+            <w:r/>
+            <w:r>
+              <w:rPr>
+                <w:b w:val="0"/>
+                <w:i w:val="0"/>
+              </w:rPr>
+              <w:t>11 columnas</w:t>
+            </w:r>
+          </w:p>
+        </w:tc>
+        <w:tc>
+          <w:tcPr>
+            <w:tcW w:type="dxa" w:w="1037"/>
+          </w:tcPr>
+          <w:p>
+            <w:r/>
+            <w:r>
+              <w:rPr>
+                <w:b w:val="0"/>
+                <w:i w:val="0"/>
+              </w:rPr>
+              <w:t>§10.1</w:t>
+            </w:r>
+          </w:p>
+        </w:tc>
+        <w:tc>
+          <w:tcPr>
+            <w:tcW w:type="dxa" w:w="4306"/>
+          </w:tcPr>
+          <w:p>
+            <w:r/>
+            <w:r>
+              <w:rPr>
+                <w:b w:val="0"/>
+                <w:i w:val="0"/>
+              </w:rPr>
+              <w:t xml:space="preserve">Es la </w:t>
+            </w:r>
+            <w:r>
+              <w:rPr>
+                <w:b/>
+                <w:i w:val="0"/>
+              </w:rPr>
+              <w:t>longitud</w:t>
+            </w:r>
+            <w:r>
+              <w:rPr>
+                <w:b w:val="0"/>
+                <w:i w:val="0"/>
+              </w:rPr>
+              <w:t xml:space="preserve"> de la lista </w:t>
+            </w:r>
+            <w:r>
+              <w:rPr>
+                <w:rFonts w:ascii="Menlo" w:hAnsi="Menlo"/>
+                <w:b w:val="0"/>
+                <w:i w:val="0"/>
+                <w:sz w:val="17"/>
+              </w:rPr>
+              <w:t>columnas_solo_en_train</w:t>
+            </w:r>
+            <w:r>
+              <w:rPr>
+                <w:b w:val="0"/>
+                <w:i w:val="0"/>
+              </w:rPr>
+              <w:t>, no un número almacenado. El verificador lee valores, no cuenta elementos. Limitación del instrumento, no cifra sin origen.</w:t>
+            </w:r>
+          </w:p>
+        </w:tc>
+      </w:tr>
+      <w:tr>
+        <w:tc>
+          <w:tcPr>
+            <w:tcW w:type="dxa" w:w="4306"/>
+          </w:tcPr>
+          <w:p>
+            <w:r/>
+            <w:r>
+              <w:rPr>
+                <w:b w:val="0"/>
+                <w:i w:val="0"/>
+              </w:rPr>
+              <w:t xml:space="preserve">Diferencias por fold, su media (0,0120), su desviación (0,0160) y el intervalo </w:t>
+            </w:r>
+            <w:r>
+              <w:rPr>
+                <w:b w:val="0"/>
+                <w:i/>
+              </w:rPr>
+              <w:t>t</w:t>
+            </w:r>
+            <w:r>
+              <w:rPr>
+                <w:b w:val="0"/>
+                <w:i w:val="0"/>
+              </w:rPr>
+              <w:t xml:space="preserve"> (−0,008 a +0,032)</w:t>
+            </w:r>
+          </w:p>
+        </w:tc>
+        <w:tc>
+          <w:tcPr>
+            <w:tcW w:type="dxa" w:w="1037"/>
+          </w:tcPr>
+          <w:p>
+            <w:r/>
+            <w:r>
+              <w:rPr>
+                <w:b w:val="0"/>
+                <w:i w:val="0"/>
+              </w:rPr>
+              <w:t>§7.4</w:t>
+            </w:r>
+          </w:p>
+        </w:tc>
+        <w:tc>
+          <w:tcPr>
+            <w:tcW w:type="dxa" w:w="4306"/>
+          </w:tcPr>
+          <w:p>
+            <w:r/>
+            <w:r>
+              <w:rPr>
+                <w:b w:val="0"/>
+                <w:i w:val="0"/>
+              </w:rPr>
               <w:t xml:space="preserve">Estadísticos derivados, calculados en este informe a partir de los pAUC por fold </w:t>
             </w:r>
             <w:r>
@@ -11666,29 +14063,39 @@
                 <w:b w:val="0"/>
                 <w:i w:val="0"/>
               </w:rPr>
-              <w:t xml:space="preserve">. La regla de trazabilidad exige que toda cifra provenga de </w:t>
-            </w:r>
-            <w:r>
-              <w:rPr>
-                <w:rFonts w:ascii="Menlo" w:hAnsi="Menlo"/>
-                <w:b w:val="0"/>
-                <w:i w:val="0"/>
-                <w:sz w:val="17"/>
-              </w:rPr>
-              <w:t>outputs/</w:t>
-            </w:r>
-            <w:r>
-              <w:rPr>
-                <w:b w:val="0"/>
-                <w:i w:val="0"/>
-              </w:rPr>
-              <w:t>; estas provienen de restar dos columnas que están allí. El cálculo es reproducible con los dos vectores del anexo y no requiere volver a entrenar nada.</w:t>
+              <w:t>. Provienen de restar dos columnas que están allí; el cálculo es reproducible con los dos vectores del anexo y no requiere volver a entrenar nada.</w:t>
             </w:r>
           </w:p>
         </w:tc>
       </w:tr>
     </w:tbl>
     <w:p/>
+    <w:p>
+      <w:pPr>
+        <w:jc w:val="both"/>
+      </w:pPr>
+      <w:r>
+        <w:rPr>
+          <w:b w:val="0"/>
+          <w:i w:val="0"/>
+        </w:rPr>
+        <w:t xml:space="preserve">Queda un residuo que conviene nombrar en vez de disimular: </w:t>
+      </w:r>
+      <w:r>
+        <w:rPr>
+          <w:b/>
+          <w:i w:val="0"/>
+        </w:rPr>
+        <w:t>esta misma sección duplica todos sus señalamientos</w:t>
+      </w:r>
+      <w:r>
+        <w:rPr>
+          <w:b w:val="0"/>
+          <w:i w:val="0"/>
+        </w:rPr>
+        <w:t>. Para justificar una cifra hay que volver a escribirla, así que cada fila de la tabla de arriba reaparece marcada, igual que las citas de los dos defectos ya corregidos. El verificador cuenta ocurrencias, no cifras distintas, y no distingue una afirmación de su propia auditoría. Es el precio de documentar la revisión dentro del documento revisado, y se prefiere a la alternativa de no dejar constancia.</w:t>
+      </w:r>
+    </w:p>
     <w:p>
       <w:pPr>
         <w:jc w:val="both"/>

</xml_diff>